<commit_message>
Correccion metodologica integral: ajuste NUTS real, modelo BYM2, tablas empiricas y eliminacion de datos simulados
</commit_message>
<xml_diff>
--- a/outputs/tables/Reporte_Tesis_Flujo_Bayesiano.docx
+++ b/outputs/tables/Reporte_Tesis_Flujo_Bayesiano.docx
@@ -177,7 +177,7 @@
                 <w:i w:val="0"/>
                 <w:sz w:val="18"/>
               </w:rPr>
-              <w:t>Registros Iniciales</w:t>
+              <w:t>Registros Iniciales (Excel crudo)</w:t>
             </w:r>
           </w:p>
         </w:tc>
@@ -401,7 +401,7 @@
                 <w:i w:val="0"/>
                 <w:sz w:val="18"/>
               </w:rPr>
-              <w:t>Registros Limpios Finales</w:t>
+              <w:t>Registros Limpios Finales (N total)</w:t>
             </w:r>
           </w:p>
         </w:tc>
@@ -457,7 +457,7 @@
                 <w:i w:val="0"/>
                 <w:sz w:val="18"/>
               </w:rPr>
-              <w:t>Valores Faltantes en Edad</w:t>
+              <w:t>Valores Faltantes en Edad (NaN)</w:t>
             </w:r>
           </w:p>
         </w:tc>
@@ -513,7 +513,119 @@
                 <w:i w:val="0"/>
                 <w:sz w:val="18"/>
               </w:rPr>
-              <w:t>Valores Faltantes en Arma</w:t>
+              <w:t>Valores Válidos en Edad (n reportado)</w:t>
+            </w:r>
+          </w:p>
+        </w:tc>
+        <w:tc>
+          <w:tcPr>
+            <w:tcW w:type="dxa" w:w="2880"/>
+            <w:shd w:fill="FFFFFF"/>
+            <w:tcMar>
+              <w:top w:w="100" w:type="dxa"/>
+              <w:bottom w:w="100" w:type="dxa"/>
+              <w:left w:w="150" w:type="dxa"/>
+              <w:right w:w="150" w:type="dxa"/>
+            </w:tcMar>
+          </w:tcPr>
+          <w:p>
+            <w:pPr>
+              <w:spacing w:after="0" w:before="0"/>
+              <w:jc w:val="center"/>
+            </w:pPr>
+            <w:r>
+              <w:rPr>
+                <w:rFonts w:ascii="Arial" w:hAnsi="Arial"/>
+                <w:b w:val="0"/>
+                <w:i w:val="0"/>
+                <w:sz w:val="18"/>
+              </w:rPr>
+              <w:t>4402</w:t>
+            </w:r>
+          </w:p>
+        </w:tc>
+      </w:tr>
+      <w:tr>
+        <w:tc>
+          <w:tcPr>
+            <w:tcW w:type="dxa" w:w="5040"/>
+            <w:shd w:fill="F9F9F9"/>
+            <w:tcMar>
+              <w:top w:w="100" w:type="dxa"/>
+              <w:bottom w:w="100" w:type="dxa"/>
+              <w:left w:w="150" w:type="dxa"/>
+              <w:right w:w="150" w:type="dxa"/>
+            </w:tcMar>
+          </w:tcPr>
+          <w:p>
+            <w:pPr>
+              <w:spacing w:after="0" w:before="0"/>
+              <w:jc w:val="center"/>
+            </w:pPr>
+            <w:r>
+              <w:rPr>
+                <w:rFonts w:ascii="Arial" w:hAnsi="Arial"/>
+                <w:b w:val="0"/>
+                <w:i w:val="0"/>
+                <w:sz w:val="18"/>
+              </w:rPr>
+              <w:t>Valores Faltantes en Antecedentes (100% - Excluido)</w:t>
+            </w:r>
+          </w:p>
+        </w:tc>
+        <w:tc>
+          <w:tcPr>
+            <w:tcW w:type="dxa" w:w="2880"/>
+            <w:shd w:fill="F9F9F9"/>
+            <w:tcMar>
+              <w:top w:w="100" w:type="dxa"/>
+              <w:bottom w:w="100" w:type="dxa"/>
+              <w:left w:w="150" w:type="dxa"/>
+              <w:right w:w="150" w:type="dxa"/>
+            </w:tcMar>
+          </w:tcPr>
+          <w:p>
+            <w:pPr>
+              <w:spacing w:after="0" w:before="0"/>
+              <w:jc w:val="center"/>
+            </w:pPr>
+            <w:r>
+              <w:rPr>
+                <w:rFonts w:ascii="Arial" w:hAnsi="Arial"/>
+                <w:b w:val="0"/>
+                <w:i w:val="0"/>
+                <w:sz w:val="18"/>
+              </w:rPr>
+              <w:t>4634</w:t>
+            </w:r>
+          </w:p>
+        </w:tc>
+      </w:tr>
+      <w:tr>
+        <w:tc>
+          <w:tcPr>
+            <w:tcW w:type="dxa" w:w="5040"/>
+            <w:shd w:fill="FFFFFF"/>
+            <w:tcMar>
+              <w:top w:w="100" w:type="dxa"/>
+              <w:bottom w:w="100" w:type="dxa"/>
+              <w:left w:w="150" w:type="dxa"/>
+              <w:right w:w="150" w:type="dxa"/>
+            </w:tcMar>
+          </w:tcPr>
+          <w:p>
+            <w:pPr>
+              <w:spacing w:after="0" w:before="0"/>
+              <w:jc w:val="center"/>
+            </w:pPr>
+            <w:r>
+              <w:rPr>
+                <w:rFonts w:ascii="Arial" w:hAnsi="Arial"/>
+                <w:b w:val="0"/>
+                <w:i w:val="0"/>
+                <w:sz w:val="18"/>
+              </w:rPr>
+              <w:t>Eventos sin Subcircuito (post-cruce)</w:t>
             </w:r>
           </w:p>
         </w:tc>
@@ -569,7 +681,7 @@
                 <w:i w:val="0"/>
                 <w:sz w:val="18"/>
               </w:rPr>
-              <w:t>Valores Faltantes en Presunto Móvil</w:t>
+              <w:t>Víctimas Hombres</w:t>
             </w:r>
           </w:p>
         </w:tc>
@@ -596,7 +708,7 @@
                 <w:i w:val="0"/>
                 <w:sz w:val="18"/>
               </w:rPr>
-              <w:t>0</w:t>
+              <w:t>4227</w:t>
             </w:r>
           </w:p>
         </w:tc>
@@ -625,7 +737,343 @@
                 <w:i w:val="0"/>
                 <w:sz w:val="18"/>
               </w:rPr>
-              <w:t>Valores Faltantes en Antecedentes</w:t>
+              <w:t>Víctimas Mujeres</w:t>
+            </w:r>
+          </w:p>
+        </w:tc>
+        <w:tc>
+          <w:tcPr>
+            <w:tcW w:type="dxa" w:w="2880"/>
+            <w:shd w:fill="FFFFFF"/>
+            <w:tcMar>
+              <w:top w:w="100" w:type="dxa"/>
+              <w:bottom w:w="100" w:type="dxa"/>
+              <w:left w:w="150" w:type="dxa"/>
+              <w:right w:w="150" w:type="dxa"/>
+            </w:tcMar>
+          </w:tcPr>
+          <w:p>
+            <w:pPr>
+              <w:spacing w:after="0" w:before="0"/>
+              <w:jc w:val="center"/>
+            </w:pPr>
+            <w:r>
+              <w:rPr>
+                <w:rFonts w:ascii="Arial" w:hAnsi="Arial"/>
+                <w:b w:val="0"/>
+                <w:i w:val="0"/>
+                <w:sz w:val="18"/>
+              </w:rPr>
+              <w:t>382</w:t>
+            </w:r>
+          </w:p>
+        </w:tc>
+      </w:tr>
+      <w:tr>
+        <w:tc>
+          <w:tcPr>
+            <w:tcW w:type="dxa" w:w="5040"/>
+            <w:shd w:fill="F9F9F9"/>
+            <w:tcMar>
+              <w:top w:w="100" w:type="dxa"/>
+              <w:bottom w:w="100" w:type="dxa"/>
+              <w:left w:w="150" w:type="dxa"/>
+              <w:right w:w="150" w:type="dxa"/>
+            </w:tcMar>
+          </w:tcPr>
+          <w:p>
+            <w:pPr>
+              <w:spacing w:after="0" w:before="0"/>
+              <w:jc w:val="center"/>
+            </w:pPr>
+            <w:r>
+              <w:rPr>
+                <w:rFonts w:ascii="Arial" w:hAnsi="Arial"/>
+                <w:b w:val="0"/>
+                <w:i w:val="0"/>
+                <w:sz w:val="18"/>
+              </w:rPr>
+              <w:t>Víctimas No Determinadas</w:t>
+            </w:r>
+          </w:p>
+        </w:tc>
+        <w:tc>
+          <w:tcPr>
+            <w:tcW w:type="dxa" w:w="2880"/>
+            <w:shd w:fill="F9F9F9"/>
+            <w:tcMar>
+              <w:top w:w="100" w:type="dxa"/>
+              <w:bottom w:w="100" w:type="dxa"/>
+              <w:left w:w="150" w:type="dxa"/>
+              <w:right w:w="150" w:type="dxa"/>
+            </w:tcMar>
+          </w:tcPr>
+          <w:p>
+            <w:pPr>
+              <w:spacing w:after="0" w:before="0"/>
+              <w:jc w:val="center"/>
+            </w:pPr>
+            <w:r>
+              <w:rPr>
+                <w:rFonts w:ascii="Arial" w:hAnsi="Arial"/>
+                <w:b w:val="0"/>
+                <w:i w:val="0"/>
+                <w:sz w:val="18"/>
+              </w:rPr>
+              <w:t>25</w:t>
+            </w:r>
+          </w:p>
+        </w:tc>
+      </w:tr>
+      <w:tr>
+        <w:tc>
+          <w:tcPr>
+            <w:tcW w:type="dxa" w:w="5040"/>
+            <w:shd w:fill="FFFFFF"/>
+            <w:tcMar>
+              <w:top w:w="100" w:type="dxa"/>
+              <w:bottom w:w="100" w:type="dxa"/>
+              <w:left w:w="150" w:type="dxa"/>
+              <w:right w:w="150" w:type="dxa"/>
+            </w:tcMar>
+          </w:tcPr>
+          <w:p>
+            <w:pPr>
+              <w:spacing w:after="0" w:before="0"/>
+              <w:jc w:val="center"/>
+            </w:pPr>
+            <w:r>
+              <w:rPr>
+                <w:rFonts w:ascii="Arial" w:hAnsi="Arial"/>
+                <w:b w:val="0"/>
+                <w:i w:val="0"/>
+                <w:sz w:val="18"/>
+              </w:rPr>
+              <w:t>Total Suma Sexo (Control)</w:t>
+            </w:r>
+          </w:p>
+        </w:tc>
+        <w:tc>
+          <w:tcPr>
+            <w:tcW w:type="dxa" w:w="2880"/>
+            <w:shd w:fill="FFFFFF"/>
+            <w:tcMar>
+              <w:top w:w="100" w:type="dxa"/>
+              <w:bottom w:w="100" w:type="dxa"/>
+              <w:left w:w="150" w:type="dxa"/>
+              <w:right w:w="150" w:type="dxa"/>
+            </w:tcMar>
+          </w:tcPr>
+          <w:p>
+            <w:pPr>
+              <w:spacing w:after="0" w:before="0"/>
+              <w:jc w:val="center"/>
+            </w:pPr>
+            <w:r>
+              <w:rPr>
+                <w:rFonts w:ascii="Arial" w:hAnsi="Arial"/>
+                <w:b w:val="0"/>
+                <w:i w:val="0"/>
+                <w:sz w:val="18"/>
+              </w:rPr>
+              <w:t>4634</w:t>
+            </w:r>
+          </w:p>
+        </w:tc>
+      </w:tr>
+      <w:tr>
+        <w:tc>
+          <w:tcPr>
+            <w:tcW w:type="dxa" w:w="5040"/>
+            <w:shd w:fill="F9F9F9"/>
+            <w:tcMar>
+              <w:top w:w="100" w:type="dxa"/>
+              <w:bottom w:w="100" w:type="dxa"/>
+              <w:left w:w="150" w:type="dxa"/>
+              <w:right w:w="150" w:type="dxa"/>
+            </w:tcMar>
+          </w:tcPr>
+          <w:p>
+            <w:pPr>
+              <w:spacing w:after="0" w:before="0"/>
+              <w:jc w:val="center"/>
+            </w:pPr>
+            <w:r>
+              <w:rPr>
+                <w:rFonts w:ascii="Arial" w:hAnsi="Arial"/>
+                <w:b w:val="0"/>
+                <w:i w:val="0"/>
+                <w:sz w:val="18"/>
+              </w:rPr>
+              <w:t>Homicidios Año 2024 (Año completo)</w:t>
+            </w:r>
+          </w:p>
+        </w:tc>
+        <w:tc>
+          <w:tcPr>
+            <w:tcW w:type="dxa" w:w="2880"/>
+            <w:shd w:fill="F9F9F9"/>
+            <w:tcMar>
+              <w:top w:w="100" w:type="dxa"/>
+              <w:bottom w:w="100" w:type="dxa"/>
+              <w:left w:w="150" w:type="dxa"/>
+              <w:right w:w="150" w:type="dxa"/>
+            </w:tcMar>
+          </w:tcPr>
+          <w:p>
+            <w:pPr>
+              <w:spacing w:after="0" w:before="0"/>
+              <w:jc w:val="center"/>
+            </w:pPr>
+            <w:r>
+              <w:rPr>
+                <w:rFonts w:ascii="Arial" w:hAnsi="Arial"/>
+                <w:b w:val="0"/>
+                <w:i w:val="0"/>
+                <w:sz w:val="18"/>
+              </w:rPr>
+              <w:t>1926</w:t>
+            </w:r>
+          </w:p>
+        </w:tc>
+      </w:tr>
+      <w:tr>
+        <w:tc>
+          <w:tcPr>
+            <w:tcW w:type="dxa" w:w="5040"/>
+            <w:shd w:fill="FFFFFF"/>
+            <w:tcMar>
+              <w:top w:w="100" w:type="dxa"/>
+              <w:bottom w:w="100" w:type="dxa"/>
+              <w:left w:w="150" w:type="dxa"/>
+              <w:right w:w="150" w:type="dxa"/>
+            </w:tcMar>
+          </w:tcPr>
+          <w:p>
+            <w:pPr>
+              <w:spacing w:after="0" w:before="0"/>
+              <w:jc w:val="center"/>
+            </w:pPr>
+            <w:r>
+              <w:rPr>
+                <w:rFonts w:ascii="Arial" w:hAnsi="Arial"/>
+                <w:b w:val="0"/>
+                <w:i w:val="0"/>
+                <w:sz w:val="18"/>
+              </w:rPr>
+              <w:t>Homicidios Año 2025 (Año completo)</w:t>
+            </w:r>
+          </w:p>
+        </w:tc>
+        <w:tc>
+          <w:tcPr>
+            <w:tcW w:type="dxa" w:w="2880"/>
+            <w:shd w:fill="FFFFFF"/>
+            <w:tcMar>
+              <w:top w:w="100" w:type="dxa"/>
+              <w:bottom w:w="100" w:type="dxa"/>
+              <w:left w:w="150" w:type="dxa"/>
+              <w:right w:w="150" w:type="dxa"/>
+            </w:tcMar>
+          </w:tcPr>
+          <w:p>
+            <w:pPr>
+              <w:spacing w:after="0" w:before="0"/>
+              <w:jc w:val="center"/>
+            </w:pPr>
+            <w:r>
+              <w:rPr>
+                <w:rFonts w:ascii="Arial" w:hAnsi="Arial"/>
+                <w:b w:val="0"/>
+                <w:i w:val="0"/>
+                <w:sz w:val="18"/>
+              </w:rPr>
+              <w:t>2506</w:t>
+            </w:r>
+          </w:p>
+        </w:tc>
+      </w:tr>
+      <w:tr>
+        <w:tc>
+          <w:tcPr>
+            <w:tcW w:type="dxa" w:w="5040"/>
+            <w:shd w:fill="F9F9F9"/>
+            <w:tcMar>
+              <w:top w:w="100" w:type="dxa"/>
+              <w:bottom w:w="100" w:type="dxa"/>
+              <w:left w:w="150" w:type="dxa"/>
+              <w:right w:w="150" w:type="dxa"/>
+            </w:tcMar>
+          </w:tcPr>
+          <w:p>
+            <w:pPr>
+              <w:spacing w:after="0" w:before="0"/>
+              <w:jc w:val="center"/>
+            </w:pPr>
+            <w:r>
+              <w:rPr>
+                <w:rFonts w:ascii="Arial" w:hAnsi="Arial"/>
+                <w:b w:val="0"/>
+                <w:i w:val="0"/>
+                <w:sz w:val="18"/>
+              </w:rPr>
+              <w:t>Homicidios Año 2026 (Solo Enero)</w:t>
+            </w:r>
+          </w:p>
+        </w:tc>
+        <w:tc>
+          <w:tcPr>
+            <w:tcW w:type="dxa" w:w="2880"/>
+            <w:shd w:fill="F9F9F9"/>
+            <w:tcMar>
+              <w:top w:w="100" w:type="dxa"/>
+              <w:bottom w:w="100" w:type="dxa"/>
+              <w:left w:w="150" w:type="dxa"/>
+              <w:right w:w="150" w:type="dxa"/>
+            </w:tcMar>
+          </w:tcPr>
+          <w:p>
+            <w:pPr>
+              <w:spacing w:after="0" w:before="0"/>
+              <w:jc w:val="center"/>
+            </w:pPr>
+            <w:r>
+              <w:rPr>
+                <w:rFonts w:ascii="Arial" w:hAnsi="Arial"/>
+                <w:b w:val="0"/>
+                <w:i w:val="0"/>
+                <w:sz w:val="18"/>
+              </w:rPr>
+              <w:t>202</w:t>
+            </w:r>
+          </w:p>
+        </w:tc>
+      </w:tr>
+      <w:tr>
+        <w:tc>
+          <w:tcPr>
+            <w:tcW w:type="dxa" w:w="5040"/>
+            <w:shd w:fill="FFFFFF"/>
+            <w:tcMar>
+              <w:top w:w="100" w:type="dxa"/>
+              <w:bottom w:w="100" w:type="dxa"/>
+              <w:left w:w="150" w:type="dxa"/>
+              <w:right w:w="150" w:type="dxa"/>
+            </w:tcMar>
+          </w:tcPr>
+          <w:p>
+            <w:pPr>
+              <w:spacing w:after="0" w:before="0"/>
+              <w:jc w:val="center"/>
+            </w:pPr>
+            <w:r>
+              <w:rPr>
+                <w:rFonts w:ascii="Arial" w:hAnsi="Arial"/>
+                <w:b w:val="0"/>
+                <w:i w:val="0"/>
+                <w:sz w:val="18"/>
+              </w:rPr>
+              <w:t>Total Suma Temporal (Control)</w:t>
             </w:r>
           </w:p>
         </w:tc>
@@ -1505,7 +1953,7 @@
                 <w:i w:val="0"/>
                 <w:sz w:val="18"/>
               </w:rPr>
-              <w:t>Número de Islas (Aislados)</w:t>
+              <w:t>Islas Iniciales (sin conectar)</w:t>
             </w:r>
           </w:p>
         </w:tc>
@@ -1588,7 +2036,7 @@
                 <w:i w:val="0"/>
                 <w:sz w:val="18"/>
               </w:rPr>
-              <w:t>Promedio de Vecinos</w:t>
+              <w:t>Islas Finales (conectadas)</w:t>
             </w:r>
           </w:p>
         </w:tc>
@@ -1615,7 +2063,7 @@
                 <w:i w:val="0"/>
                 <w:sz w:val="18"/>
               </w:rPr>
-              <w:t>5.20</w:t>
+              <w:t>0.0000</w:t>
             </w:r>
           </w:p>
         </w:tc>
@@ -1642,7 +2090,7 @@
                 <w:i w:val="0"/>
                 <w:sz w:val="18"/>
               </w:rPr>
-              <w:t>4.73</w:t>
+              <w:t>0.0000</w:t>
             </w:r>
           </w:p>
         </w:tc>
@@ -1671,7 +2119,7 @@
                 <w:i w:val="0"/>
                 <w:sz w:val="18"/>
               </w:rPr>
-              <w:t>Densidad de la Matriz (%)</w:t>
+              <w:t>Promedio de Vecinos</w:t>
             </w:r>
           </w:p>
         </w:tc>
@@ -1698,7 +2146,7 @@
                 <w:i w:val="0"/>
                 <w:sz w:val="18"/>
               </w:rPr>
-              <w:t>212.98</w:t>
+              <w:t>5.25</w:t>
             </w:r>
           </w:p>
         </w:tc>
@@ -1725,7 +2173,7 @@
                 <w:i w:val="0"/>
                 <w:sz w:val="18"/>
               </w:rPr>
-              <w:t>193.83</w:t>
+              <w:t>4.78</w:t>
             </w:r>
           </w:p>
         </w:tc>
@@ -1754,7 +2202,7 @@
                 <w:i w:val="0"/>
                 <w:sz w:val="18"/>
               </w:rPr>
-              <w:t>Máximo número de vecinos</w:t>
+              <w:t>Densidad de la Matriz (%)</w:t>
             </w:r>
           </w:p>
         </w:tc>
@@ -1781,6 +2229,89 @@
                 <w:i w:val="0"/>
                 <w:sz w:val="18"/>
               </w:rPr>
+              <w:t>215.00</w:t>
+            </w:r>
+          </w:p>
+        </w:tc>
+        <w:tc>
+          <w:tcPr>
+            <w:tcW w:type="dxa" w:w="2880"/>
+            <w:shd w:fill="FFFFFF"/>
+            <w:tcMar>
+              <w:top w:w="100" w:type="dxa"/>
+              <w:bottom w:w="100" w:type="dxa"/>
+              <w:left w:w="150" w:type="dxa"/>
+              <w:right w:w="150" w:type="dxa"/>
+            </w:tcMar>
+          </w:tcPr>
+          <w:p>
+            <w:pPr>
+              <w:spacing w:after="0" w:before="0"/>
+              <w:jc w:val="center"/>
+            </w:pPr>
+            <w:r>
+              <w:rPr>
+                <w:rFonts w:ascii="Arial" w:hAnsi="Arial"/>
+                <w:b w:val="0"/>
+                <w:i w:val="0"/>
+                <w:sz w:val="18"/>
+              </w:rPr>
+              <w:t>195.85</w:t>
+            </w:r>
+          </w:p>
+        </w:tc>
+      </w:tr>
+      <w:tr>
+        <w:tc>
+          <w:tcPr>
+            <w:tcW w:type="dxa" w:w="3600"/>
+            <w:shd w:fill="F9F9F9"/>
+            <w:tcMar>
+              <w:top w:w="100" w:type="dxa"/>
+              <w:bottom w:w="100" w:type="dxa"/>
+              <w:left w:w="150" w:type="dxa"/>
+              <w:right w:w="150" w:type="dxa"/>
+            </w:tcMar>
+          </w:tcPr>
+          <w:p>
+            <w:pPr>
+              <w:spacing w:after="0" w:before="0"/>
+              <w:jc w:val="center"/>
+            </w:pPr>
+            <w:r>
+              <w:rPr>
+                <w:rFonts w:ascii="Arial" w:hAnsi="Arial"/>
+                <w:b w:val="0"/>
+                <w:i w:val="0"/>
+                <w:sz w:val="18"/>
+              </w:rPr>
+              <w:t>Máximo número de vecinos</w:t>
+            </w:r>
+          </w:p>
+        </w:tc>
+        <w:tc>
+          <w:tcPr>
+            <w:tcW w:type="dxa" w:w="2880"/>
+            <w:shd w:fill="F9F9F9"/>
+            <w:tcMar>
+              <w:top w:w="100" w:type="dxa"/>
+              <w:bottom w:w="100" w:type="dxa"/>
+              <w:left w:w="150" w:type="dxa"/>
+              <w:right w:w="150" w:type="dxa"/>
+            </w:tcMar>
+          </w:tcPr>
+          <w:p>
+            <w:pPr>
+              <w:spacing w:after="0" w:before="0"/>
+              <w:jc w:val="center"/>
+            </w:pPr>
+            <w:r>
+              <w:rPr>
+                <w:rFonts w:ascii="Arial" w:hAnsi="Arial"/>
+                <w:b w:val="0"/>
+                <w:i w:val="0"/>
+                <w:sz w:val="18"/>
+              </w:rPr>
               <w:t>17.00</w:t>
             </w:r>
           </w:p>
@@ -1788,7 +2319,7 @@
         <w:tc>
           <w:tcPr>
             <w:tcW w:type="dxa" w:w="2880"/>
-            <w:shd w:fill="FFFFFF"/>
+            <w:shd w:fill="F9F9F9"/>
             <w:tcMar>
               <w:top w:w="100" w:type="dxa"/>
               <w:bottom w:w="100" w:type="dxa"/>
@@ -1817,7 +2348,7 @@
         <w:tc>
           <w:tcPr>
             <w:tcW w:type="dxa" w:w="3600"/>
-            <w:shd w:fill="F9F9F9"/>
+            <w:shd w:fill="FFFFFF"/>
             <w:tcMar>
               <w:top w:w="100" w:type="dxa"/>
               <w:bottom w:w="100" w:type="dxa"/>
@@ -1844,7 +2375,7 @@
         <w:tc>
           <w:tcPr>
             <w:tcW w:type="dxa" w:w="2880"/>
-            <w:shd w:fill="F9F9F9"/>
+            <w:shd w:fill="FFFFFF"/>
             <w:tcMar>
               <w:top w:w="100" w:type="dxa"/>
               <w:bottom w:w="100" w:type="dxa"/>
@@ -1864,14 +2395,14 @@
                 <w:i w:val="0"/>
                 <w:sz w:val="18"/>
               </w:rPr>
-              <w:t>0.0000</w:t>
+              <w:t>1.00</w:t>
             </w:r>
           </w:p>
         </w:tc>
         <w:tc>
           <w:tcPr>
             <w:tcW w:type="dxa" w:w="2880"/>
-            <w:shd w:fill="F9F9F9"/>
+            <w:shd w:fill="FFFFFF"/>
             <w:tcMar>
               <w:top w:w="100" w:type="dxa"/>
               <w:bottom w:w="100" w:type="dxa"/>
@@ -1891,7 +2422,7 @@
                 <w:i w:val="0"/>
                 <w:sz w:val="18"/>
               </w:rPr>
-              <w:t>0.0000</w:t>
+              <w:t>1.00</w:t>
             </w:r>
           </w:p>
         </w:tc>
@@ -2054,7 +2585,7 @@
                 <w:i w:val="0"/>
                 <w:sz w:val="18"/>
               </w:rPr>
-              <w:t>0.1730</w:t>
+              <w:t>0.1103</w:t>
             </w:r>
           </w:p>
         </w:tc>
@@ -2166,7 +2697,7 @@
                 <w:i w:val="0"/>
                 <w:sz w:val="18"/>
               </w:rPr>
-              <w:t>4.36</w:t>
+              <w:t>2.83</w:t>
             </w:r>
           </w:p>
         </w:tc>
@@ -2222,7 +2753,7 @@
                 <w:i w:val="0"/>
                 <w:sz w:val="18"/>
               </w:rPr>
-              <w:t>0.0004</w:t>
+              <w:t>0.0079</w:t>
             </w:r>
           </w:p>
         </w:tc>
@@ -2414,7 +2945,7 @@
                 <w:i w:val="0"/>
                 <w:sz w:val="18"/>
               </w:rPr>
-              <w:t>-15523.0145</w:t>
+              <w:t>-3550.6550</w:t>
             </w:r>
           </w:p>
         </w:tc>
@@ -2441,7 +2972,7 @@
                 <w:i w:val="0"/>
                 <w:sz w:val="18"/>
               </w:rPr>
-              <w:t>-1962.8629</w:t>
+              <w:t>-1553.4064</w:t>
             </w:r>
           </w:p>
         </w:tc>
@@ -2497,7 +3028,7 @@
                 <w:i w:val="0"/>
                 <w:sz w:val="18"/>
               </w:rPr>
-              <w:t>31052.03</w:t>
+              <w:t>7107.31</w:t>
             </w:r>
           </w:p>
         </w:tc>
@@ -2524,7 +3055,7 @@
                 <w:i w:val="0"/>
                 <w:sz w:val="18"/>
               </w:rPr>
-              <w:t>3933.73</w:t>
+              <w:t>3114.81</w:t>
             </w:r>
           </w:p>
         </w:tc>
@@ -2580,7 +3111,7 @@
                 <w:i w:val="0"/>
                 <w:sz w:val="18"/>
               </w:rPr>
-              <w:t>31065.82</w:t>
+              <w:t>7119.88</w:t>
             </w:r>
           </w:p>
         </w:tc>
@@ -2607,7 +3138,7 @@
                 <w:i w:val="0"/>
                 <w:sz w:val="18"/>
               </w:rPr>
-              <w:t>3952.11</w:t>
+              <w:t>3131.57</w:t>
             </w:r>
           </w:p>
         </w:tc>
@@ -2663,7 +3194,7 @@
                 <w:i w:val="0"/>
                 <w:sz w:val="18"/>
               </w:rPr>
-              <w:t>0.0732</w:t>
+              <w:t>0.0507</w:t>
             </w:r>
           </w:p>
         </w:tc>
@@ -2690,7 +3221,7 @@
                 <w:i w:val="0"/>
                 <w:sz w:val="18"/>
               </w:rPr>
-              <w:t>nan</w:t>
+              <w:t>0.0106</w:t>
             </w:r>
           </w:p>
         </w:tc>
@@ -2913,7 +3444,7 @@
                 <w:i w:val="0"/>
                 <w:sz w:val="18"/>
               </w:rPr>
-              <w:t>TRINITARIA NORTE 4</w:t>
+              <w:t>NUEVA PROSPERINA 2</w:t>
             </w:r>
           </w:p>
         </w:tc>
@@ -2940,7 +3471,7 @@
                 <w:i w:val="0"/>
                 <w:sz w:val="18"/>
               </w:rPr>
-              <w:t>TRINITARIA NORTE</w:t>
+              <w:t>NUEVA PROSPERINA</w:t>
             </w:r>
           </w:p>
         </w:tc>
@@ -2967,7 +3498,7 @@
                 <w:i w:val="0"/>
                 <w:sz w:val="18"/>
               </w:rPr>
-              <w:t>ESTEROS</w:t>
+              <w:t>NUEVA PROSPERINA</w:t>
             </w:r>
           </w:p>
         </w:tc>
@@ -2994,7 +3525,7 @@
                 <w:i w:val="0"/>
                 <w:sz w:val="18"/>
               </w:rPr>
-              <w:t>23.97</w:t>
+              <w:t>4.10</w:t>
             </w:r>
           </w:p>
         </w:tc>
@@ -3021,7 +3552,281 @@
                 <w:i w:val="0"/>
                 <w:sz w:val="18"/>
               </w:rPr>
-              <w:t>1.00</w:t>
+              <w:t>0.9998</w:t>
+            </w:r>
+          </w:p>
+        </w:tc>
+      </w:tr>
+      <w:tr>
+        <w:tc>
+          <w:tcPr>
+            <w:tcW w:type="dxa" w:w="2880"/>
+            <w:shd w:fill="F9F9F9"/>
+            <w:tcMar>
+              <w:top w:w="100" w:type="dxa"/>
+              <w:bottom w:w="100" w:type="dxa"/>
+              <w:left w:w="150" w:type="dxa"/>
+              <w:right w:w="150" w:type="dxa"/>
+            </w:tcMar>
+          </w:tcPr>
+          <w:p>
+            <w:pPr>
+              <w:spacing w:after="0" w:before="0"/>
+              <w:jc w:val="center"/>
+            </w:pPr>
+            <w:r>
+              <w:rPr>
+                <w:rFonts w:ascii="Arial" w:hAnsi="Arial"/>
+                <w:b w:val="0"/>
+                <w:i w:val="0"/>
+                <w:sz w:val="18"/>
+              </w:rPr>
+              <w:t>NUEVO GUAYAQUIL 3</w:t>
+            </w:r>
+          </w:p>
+        </w:tc>
+        <w:tc>
+          <w:tcPr>
+            <w:tcW w:type="dxa" w:w="2160"/>
+            <w:shd w:fill="F9F9F9"/>
+            <w:tcMar>
+              <w:top w:w="100" w:type="dxa"/>
+              <w:bottom w:w="100" w:type="dxa"/>
+              <w:left w:w="150" w:type="dxa"/>
+              <w:right w:w="150" w:type="dxa"/>
+            </w:tcMar>
+          </w:tcPr>
+          <w:p>
+            <w:pPr>
+              <w:spacing w:after="0" w:before="0"/>
+              <w:jc w:val="center"/>
+            </w:pPr>
+            <w:r>
+              <w:rPr>
+                <w:rFonts w:ascii="Arial" w:hAnsi="Arial"/>
+                <w:b w:val="0"/>
+                <w:i w:val="0"/>
+                <w:sz w:val="18"/>
+              </w:rPr>
+              <w:t>NUEVO GUAYAQUIL</w:t>
+            </w:r>
+          </w:p>
+        </w:tc>
+        <w:tc>
+          <w:tcPr>
+            <w:tcW w:type="dxa" w:w="2160"/>
+            <w:shd w:fill="F9F9F9"/>
+            <w:tcMar>
+              <w:top w:w="100" w:type="dxa"/>
+              <w:bottom w:w="100" w:type="dxa"/>
+              <w:left w:w="150" w:type="dxa"/>
+              <w:right w:w="150" w:type="dxa"/>
+            </w:tcMar>
+          </w:tcPr>
+          <w:p>
+            <w:pPr>
+              <w:spacing w:after="0" w:before="0"/>
+              <w:jc w:val="center"/>
+            </w:pPr>
+            <w:r>
+              <w:rPr>
+                <w:rFonts w:ascii="Arial" w:hAnsi="Arial"/>
+                <w:b w:val="0"/>
+                <w:i w:val="0"/>
+                <w:sz w:val="18"/>
+              </w:rPr>
+              <w:t>NUEVA PROSPERINA</w:t>
+            </w:r>
+          </w:p>
+        </w:tc>
+        <w:tc>
+          <w:tcPr>
+            <w:tcW w:type="dxa" w:w="2160"/>
+            <w:shd w:fill="F9F9F9"/>
+            <w:tcMar>
+              <w:top w:w="100" w:type="dxa"/>
+              <w:bottom w:w="100" w:type="dxa"/>
+              <w:left w:w="150" w:type="dxa"/>
+              <w:right w:w="150" w:type="dxa"/>
+            </w:tcMar>
+          </w:tcPr>
+          <w:p>
+            <w:pPr>
+              <w:spacing w:after="0" w:before="0"/>
+              <w:jc w:val="center"/>
+            </w:pPr>
+            <w:r>
+              <w:rPr>
+                <w:rFonts w:ascii="Arial" w:hAnsi="Arial"/>
+                <w:b w:val="0"/>
+                <w:i w:val="0"/>
+                <w:sz w:val="18"/>
+              </w:rPr>
+              <w:t>4.02</w:t>
+            </w:r>
+          </w:p>
+        </w:tc>
+        <w:tc>
+          <w:tcPr>
+            <w:tcW w:type="dxa" w:w="1440"/>
+            <w:shd w:fill="F9F9F9"/>
+            <w:tcMar>
+              <w:top w:w="100" w:type="dxa"/>
+              <w:bottom w:w="100" w:type="dxa"/>
+              <w:left w:w="150" w:type="dxa"/>
+              <w:right w:w="150" w:type="dxa"/>
+            </w:tcMar>
+          </w:tcPr>
+          <w:p>
+            <w:pPr>
+              <w:spacing w:after="0" w:before="0"/>
+              <w:jc w:val="center"/>
+            </w:pPr>
+            <w:r>
+              <w:rPr>
+                <w:rFonts w:ascii="Arial" w:hAnsi="Arial"/>
+                <w:b w:val="0"/>
+                <w:i w:val="0"/>
+                <w:sz w:val="18"/>
+              </w:rPr>
+              <w:t>0.9998</w:t>
+            </w:r>
+          </w:p>
+        </w:tc>
+      </w:tr>
+      <w:tr>
+        <w:tc>
+          <w:tcPr>
+            <w:tcW w:type="dxa" w:w="2880"/>
+            <w:shd w:fill="FFFFFF"/>
+            <w:tcMar>
+              <w:top w:w="100" w:type="dxa"/>
+              <w:bottom w:w="100" w:type="dxa"/>
+              <w:left w:w="150" w:type="dxa"/>
+              <w:right w:w="150" w:type="dxa"/>
+            </w:tcMar>
+          </w:tcPr>
+          <w:p>
+            <w:pPr>
+              <w:spacing w:after="0" w:before="0"/>
+              <w:jc w:val="center"/>
+            </w:pPr>
+            <w:r>
+              <w:rPr>
+                <w:rFonts w:ascii="Arial" w:hAnsi="Arial"/>
+                <w:b w:val="0"/>
+                <w:i w:val="0"/>
+                <w:sz w:val="18"/>
+              </w:rPr>
+              <w:t>PARAISO LA FLOR 4</w:t>
+            </w:r>
+          </w:p>
+        </w:tc>
+        <w:tc>
+          <w:tcPr>
+            <w:tcW w:type="dxa" w:w="2160"/>
+            <w:shd w:fill="FFFFFF"/>
+            <w:tcMar>
+              <w:top w:w="100" w:type="dxa"/>
+              <w:bottom w:w="100" w:type="dxa"/>
+              <w:left w:w="150" w:type="dxa"/>
+              <w:right w:w="150" w:type="dxa"/>
+            </w:tcMar>
+          </w:tcPr>
+          <w:p>
+            <w:pPr>
+              <w:spacing w:after="0" w:before="0"/>
+              <w:jc w:val="center"/>
+            </w:pPr>
+            <w:r>
+              <w:rPr>
+                <w:rFonts w:ascii="Arial" w:hAnsi="Arial"/>
+                <w:b w:val="0"/>
+                <w:i w:val="0"/>
+                <w:sz w:val="18"/>
+              </w:rPr>
+              <w:t>PARAISO LA FLOR</w:t>
+            </w:r>
+          </w:p>
+        </w:tc>
+        <w:tc>
+          <w:tcPr>
+            <w:tcW w:type="dxa" w:w="2160"/>
+            <w:shd w:fill="FFFFFF"/>
+            <w:tcMar>
+              <w:top w:w="100" w:type="dxa"/>
+              <w:bottom w:w="100" w:type="dxa"/>
+              <w:left w:w="150" w:type="dxa"/>
+              <w:right w:w="150" w:type="dxa"/>
+            </w:tcMar>
+          </w:tcPr>
+          <w:p>
+            <w:pPr>
+              <w:spacing w:after="0" w:before="0"/>
+              <w:jc w:val="center"/>
+            </w:pPr>
+            <w:r>
+              <w:rPr>
+                <w:rFonts w:ascii="Arial" w:hAnsi="Arial"/>
+                <w:b w:val="0"/>
+                <w:i w:val="0"/>
+                <w:sz w:val="18"/>
+              </w:rPr>
+              <w:t>NUEVA PROSPERINA</w:t>
+            </w:r>
+          </w:p>
+        </w:tc>
+        <w:tc>
+          <w:tcPr>
+            <w:tcW w:type="dxa" w:w="2160"/>
+            <w:shd w:fill="FFFFFF"/>
+            <w:tcMar>
+              <w:top w:w="100" w:type="dxa"/>
+              <w:bottom w:w="100" w:type="dxa"/>
+              <w:left w:w="150" w:type="dxa"/>
+              <w:right w:w="150" w:type="dxa"/>
+            </w:tcMar>
+          </w:tcPr>
+          <w:p>
+            <w:pPr>
+              <w:spacing w:after="0" w:before="0"/>
+              <w:jc w:val="center"/>
+            </w:pPr>
+            <w:r>
+              <w:rPr>
+                <w:rFonts w:ascii="Arial" w:hAnsi="Arial"/>
+                <w:b w:val="0"/>
+                <w:i w:val="0"/>
+                <w:sz w:val="18"/>
+              </w:rPr>
+              <w:t>3.93</w:t>
+            </w:r>
+          </w:p>
+        </w:tc>
+        <w:tc>
+          <w:tcPr>
+            <w:tcW w:type="dxa" w:w="1440"/>
+            <w:shd w:fill="FFFFFF"/>
+            <w:tcMar>
+              <w:top w:w="100" w:type="dxa"/>
+              <w:bottom w:w="100" w:type="dxa"/>
+              <w:left w:w="150" w:type="dxa"/>
+              <w:right w:w="150" w:type="dxa"/>
+            </w:tcMar>
+          </w:tcPr>
+          <w:p>
+            <w:pPr>
+              <w:spacing w:after="0" w:before="0"/>
+              <w:jc w:val="center"/>
+            </w:pPr>
+            <w:r>
+              <w:rPr>
+                <w:rFonts w:ascii="Arial" w:hAnsi="Arial"/>
+                <w:b w:val="0"/>
+                <w:i w:val="0"/>
+                <w:sz w:val="18"/>
+              </w:rPr>
+              <w:t>0.9995</w:t>
             </w:r>
           </w:p>
         </w:tc>
@@ -3131,7 +3936,7 @@
                 <w:i w:val="0"/>
                 <w:sz w:val="18"/>
               </w:rPr>
-              <w:t>21.02</w:t>
+              <w:t>3.89</w:t>
             </w:r>
           </w:p>
         </w:tc>
@@ -3158,7 +3963,7 @@
                 <w:i w:val="0"/>
                 <w:sz w:val="18"/>
               </w:rPr>
-              <w:t>1.00</w:t>
+              <w:t>0.9998</w:t>
             </w:r>
           </w:p>
         </w:tc>
@@ -3187,7 +3992,7 @@
                 <w:i w:val="0"/>
                 <w:sz w:val="18"/>
               </w:rPr>
-              <w:t>SUBURBIO 1</w:t>
+              <w:t>PASCUALES 2</w:t>
             </w:r>
           </w:p>
         </w:tc>
@@ -3214,7 +4019,7 @@
                 <w:i w:val="0"/>
                 <w:sz w:val="18"/>
               </w:rPr>
-              <w:t>SUBURBIO</w:t>
+              <w:t>PASCUALES</w:t>
             </w:r>
           </w:p>
         </w:tc>
@@ -3241,7 +4046,7 @@
                 <w:i w:val="0"/>
                 <w:sz w:val="18"/>
               </w:rPr>
-              <w:t>PORTETE</w:t>
+              <w:t>PASCUALES</w:t>
             </w:r>
           </w:p>
         </w:tc>
@@ -3268,7 +4073,7 @@
                 <w:i w:val="0"/>
                 <w:sz w:val="18"/>
               </w:rPr>
-              <w:t>20.48</w:t>
+              <w:t>3.74</w:t>
             </w:r>
           </w:p>
         </w:tc>
@@ -3295,7 +4100,7 @@
                 <w:i w:val="0"/>
                 <w:sz w:val="18"/>
               </w:rPr>
-              <w:t>0.9983</w:t>
+              <w:t>0.9990</w:t>
             </w:r>
           </w:p>
         </w:tc>
@@ -3324,7 +4129,7 @@
                 <w:i w:val="0"/>
                 <w:sz w:val="18"/>
               </w:rPr>
-              <w:t>TRINITARIA SUR 4</w:t>
+              <w:t>SAN FRANCISCO 2</w:t>
             </w:r>
           </w:p>
         </w:tc>
@@ -3351,7 +4156,7 @@
                 <w:i w:val="0"/>
                 <w:sz w:val="18"/>
               </w:rPr>
-              <w:t>TRINITARIA SUR</w:t>
+              <w:t>SAN FRANCISCO</w:t>
             </w:r>
           </w:p>
         </w:tc>
@@ -3378,7 +4183,7 @@
                 <w:i w:val="0"/>
                 <w:sz w:val="18"/>
               </w:rPr>
-              <w:t>ESTEROS</w:t>
+              <w:t>PASCUALES</w:t>
             </w:r>
           </w:p>
         </w:tc>
@@ -3405,7 +4210,7 @@
                 <w:i w:val="0"/>
                 <w:sz w:val="18"/>
               </w:rPr>
-              <w:t>17.50</w:t>
+              <w:t>3.65</w:t>
             </w:r>
           </w:p>
         </w:tc>
@@ -3432,7 +4237,7 @@
                 <w:i w:val="0"/>
                 <w:sz w:val="18"/>
               </w:rPr>
-              <w:t>1.00</w:t>
+              <w:t>0.9980</w:t>
             </w:r>
           </w:p>
         </w:tc>
@@ -3461,7 +4266,7 @@
                 <w:i w:val="0"/>
                 <w:sz w:val="18"/>
               </w:rPr>
-              <w:t>NUEVO GUAYAQUIL 3</w:t>
+              <w:t>TRINITARIA NORTE 2</w:t>
             </w:r>
           </w:p>
         </w:tc>
@@ -3488,555 +4293,7 @@
                 <w:i w:val="0"/>
                 <w:sz w:val="18"/>
               </w:rPr>
-              <w:t>NUEVO GUAYAQUIL</w:t>
-            </w:r>
-          </w:p>
-        </w:tc>
-        <w:tc>
-          <w:tcPr>
-            <w:tcW w:type="dxa" w:w="2160"/>
-            <w:shd w:fill="FFFFFF"/>
-            <w:tcMar>
-              <w:top w:w="100" w:type="dxa"/>
-              <w:bottom w:w="100" w:type="dxa"/>
-              <w:left w:w="150" w:type="dxa"/>
-              <w:right w:w="150" w:type="dxa"/>
-            </w:tcMar>
-          </w:tcPr>
-          <w:p>
-            <w:pPr>
-              <w:spacing w:after="0" w:before="0"/>
-              <w:jc w:val="center"/>
-            </w:pPr>
-            <w:r>
-              <w:rPr>
-                <w:rFonts w:ascii="Arial" w:hAnsi="Arial"/>
-                <w:b w:val="0"/>
-                <w:i w:val="0"/>
-                <w:sz w:val="18"/>
-              </w:rPr>
-              <w:t>NUEVA PROSPERINA</w:t>
-            </w:r>
-          </w:p>
-        </w:tc>
-        <w:tc>
-          <w:tcPr>
-            <w:tcW w:type="dxa" w:w="2160"/>
-            <w:shd w:fill="FFFFFF"/>
-            <w:tcMar>
-              <w:top w:w="100" w:type="dxa"/>
-              <w:bottom w:w="100" w:type="dxa"/>
-              <w:left w:w="150" w:type="dxa"/>
-              <w:right w:w="150" w:type="dxa"/>
-            </w:tcMar>
-          </w:tcPr>
-          <w:p>
-            <w:pPr>
-              <w:spacing w:after="0" w:before="0"/>
-              <w:jc w:val="center"/>
-            </w:pPr>
-            <w:r>
-              <w:rPr>
-                <w:rFonts w:ascii="Arial" w:hAnsi="Arial"/>
-                <w:b w:val="0"/>
-                <w:i w:val="0"/>
-                <w:sz w:val="18"/>
-              </w:rPr>
-              <w:t>17.13</w:t>
-            </w:r>
-          </w:p>
-        </w:tc>
-        <w:tc>
-          <w:tcPr>
-            <w:tcW w:type="dxa" w:w="1440"/>
-            <w:shd w:fill="FFFFFF"/>
-            <w:tcMar>
-              <w:top w:w="100" w:type="dxa"/>
-              <w:bottom w:w="100" w:type="dxa"/>
-              <w:left w:w="150" w:type="dxa"/>
-              <w:right w:w="150" w:type="dxa"/>
-            </w:tcMar>
-          </w:tcPr>
-          <w:p>
-            <w:pPr>
-              <w:spacing w:after="0" w:before="0"/>
-              <w:jc w:val="center"/>
-            </w:pPr>
-            <w:r>
-              <w:rPr>
-                <w:rFonts w:ascii="Arial" w:hAnsi="Arial"/>
-                <w:b w:val="0"/>
-                <w:i w:val="0"/>
-                <w:sz w:val="18"/>
-              </w:rPr>
-              <w:t>1.00</w:t>
-            </w:r>
-          </w:p>
-        </w:tc>
-      </w:tr>
-      <w:tr>
-        <w:tc>
-          <w:tcPr>
-            <w:tcW w:type="dxa" w:w="2880"/>
-            <w:shd w:fill="F9F9F9"/>
-            <w:tcMar>
-              <w:top w:w="100" w:type="dxa"/>
-              <w:bottom w:w="100" w:type="dxa"/>
-              <w:left w:w="150" w:type="dxa"/>
-              <w:right w:w="150" w:type="dxa"/>
-            </w:tcMar>
-          </w:tcPr>
-          <w:p>
-            <w:pPr>
-              <w:spacing w:after="0" w:before="0"/>
-              <w:jc w:val="center"/>
-            </w:pPr>
-            <w:r>
-              <w:rPr>
-                <w:rFonts w:ascii="Arial" w:hAnsi="Arial"/>
-                <w:b w:val="0"/>
-                <w:i w:val="0"/>
-                <w:sz w:val="18"/>
-              </w:rPr>
-              <w:t>TRINITARIA NORTE 2</w:t>
-            </w:r>
-          </w:p>
-        </w:tc>
-        <w:tc>
-          <w:tcPr>
-            <w:tcW w:type="dxa" w:w="2160"/>
-            <w:shd w:fill="F9F9F9"/>
-            <w:tcMar>
-              <w:top w:w="100" w:type="dxa"/>
-              <w:bottom w:w="100" w:type="dxa"/>
-              <w:left w:w="150" w:type="dxa"/>
-              <w:right w:w="150" w:type="dxa"/>
-            </w:tcMar>
-          </w:tcPr>
-          <w:p>
-            <w:pPr>
-              <w:spacing w:after="0" w:before="0"/>
-              <w:jc w:val="center"/>
-            </w:pPr>
-            <w:r>
-              <w:rPr>
-                <w:rFonts w:ascii="Arial" w:hAnsi="Arial"/>
-                <w:b w:val="0"/>
-                <w:i w:val="0"/>
-                <w:sz w:val="18"/>
-              </w:rPr>
               <w:t>TRINITARIA NORTE</w:t>
-            </w:r>
-          </w:p>
-        </w:tc>
-        <w:tc>
-          <w:tcPr>
-            <w:tcW w:type="dxa" w:w="2160"/>
-            <w:shd w:fill="F9F9F9"/>
-            <w:tcMar>
-              <w:top w:w="100" w:type="dxa"/>
-              <w:bottom w:w="100" w:type="dxa"/>
-              <w:left w:w="150" w:type="dxa"/>
-              <w:right w:w="150" w:type="dxa"/>
-            </w:tcMar>
-          </w:tcPr>
-          <w:p>
-            <w:pPr>
-              <w:spacing w:after="0" w:before="0"/>
-              <w:jc w:val="center"/>
-            </w:pPr>
-            <w:r>
-              <w:rPr>
-                <w:rFonts w:ascii="Arial" w:hAnsi="Arial"/>
-                <w:b w:val="0"/>
-                <w:i w:val="0"/>
-                <w:sz w:val="18"/>
-              </w:rPr>
-              <w:t>ESTEROS</w:t>
-            </w:r>
-          </w:p>
-        </w:tc>
-        <w:tc>
-          <w:tcPr>
-            <w:tcW w:type="dxa" w:w="2160"/>
-            <w:shd w:fill="F9F9F9"/>
-            <w:tcMar>
-              <w:top w:w="100" w:type="dxa"/>
-              <w:bottom w:w="100" w:type="dxa"/>
-              <w:left w:w="150" w:type="dxa"/>
-              <w:right w:w="150" w:type="dxa"/>
-            </w:tcMar>
-          </w:tcPr>
-          <w:p>
-            <w:pPr>
-              <w:spacing w:after="0" w:before="0"/>
-              <w:jc w:val="center"/>
-            </w:pPr>
-            <w:r>
-              <w:rPr>
-                <w:rFonts w:ascii="Arial" w:hAnsi="Arial"/>
-                <w:b w:val="0"/>
-                <w:i w:val="0"/>
-                <w:sz w:val="18"/>
-              </w:rPr>
-              <w:t>17.08</w:t>
-            </w:r>
-          </w:p>
-        </w:tc>
-        <w:tc>
-          <w:tcPr>
-            <w:tcW w:type="dxa" w:w="1440"/>
-            <w:shd w:fill="F9F9F9"/>
-            <w:tcMar>
-              <w:top w:w="100" w:type="dxa"/>
-              <w:bottom w:w="100" w:type="dxa"/>
-              <w:left w:w="150" w:type="dxa"/>
-              <w:right w:w="150" w:type="dxa"/>
-            </w:tcMar>
-          </w:tcPr>
-          <w:p>
-            <w:pPr>
-              <w:spacing w:after="0" w:before="0"/>
-              <w:jc w:val="center"/>
-            </w:pPr>
-            <w:r>
-              <w:rPr>
-                <w:rFonts w:ascii="Arial" w:hAnsi="Arial"/>
-                <w:b w:val="0"/>
-                <w:i w:val="0"/>
-                <w:sz w:val="18"/>
-              </w:rPr>
-              <w:t>0.9983</w:t>
-            </w:r>
-          </w:p>
-        </w:tc>
-      </w:tr>
-      <w:tr>
-        <w:tc>
-          <w:tcPr>
-            <w:tcW w:type="dxa" w:w="2880"/>
-            <w:shd w:fill="FFFFFF"/>
-            <w:tcMar>
-              <w:top w:w="100" w:type="dxa"/>
-              <w:bottom w:w="100" w:type="dxa"/>
-              <w:left w:w="150" w:type="dxa"/>
-              <w:right w:w="150" w:type="dxa"/>
-            </w:tcMar>
-          </w:tcPr>
-          <w:p>
-            <w:pPr>
-              <w:spacing w:after="0" w:before="0"/>
-              <w:jc w:val="center"/>
-            </w:pPr>
-            <w:r>
-              <w:rPr>
-                <w:rFonts w:ascii="Arial" w:hAnsi="Arial"/>
-                <w:b w:val="0"/>
-                <w:i w:val="0"/>
-                <w:sz w:val="18"/>
-              </w:rPr>
-              <w:t>PARAISO LA FLOR 4</w:t>
-            </w:r>
-          </w:p>
-        </w:tc>
-        <w:tc>
-          <w:tcPr>
-            <w:tcW w:type="dxa" w:w="2160"/>
-            <w:shd w:fill="FFFFFF"/>
-            <w:tcMar>
-              <w:top w:w="100" w:type="dxa"/>
-              <w:bottom w:w="100" w:type="dxa"/>
-              <w:left w:w="150" w:type="dxa"/>
-              <w:right w:w="150" w:type="dxa"/>
-            </w:tcMar>
-          </w:tcPr>
-          <w:p>
-            <w:pPr>
-              <w:spacing w:after="0" w:before="0"/>
-              <w:jc w:val="center"/>
-            </w:pPr>
-            <w:r>
-              <w:rPr>
-                <w:rFonts w:ascii="Arial" w:hAnsi="Arial"/>
-                <w:b w:val="0"/>
-                <w:i w:val="0"/>
-                <w:sz w:val="18"/>
-              </w:rPr>
-              <w:t>PARAISO LA FLOR</w:t>
-            </w:r>
-          </w:p>
-        </w:tc>
-        <w:tc>
-          <w:tcPr>
-            <w:tcW w:type="dxa" w:w="2160"/>
-            <w:shd w:fill="FFFFFF"/>
-            <w:tcMar>
-              <w:top w:w="100" w:type="dxa"/>
-              <w:bottom w:w="100" w:type="dxa"/>
-              <w:left w:w="150" w:type="dxa"/>
-              <w:right w:w="150" w:type="dxa"/>
-            </w:tcMar>
-          </w:tcPr>
-          <w:p>
-            <w:pPr>
-              <w:spacing w:after="0" w:before="0"/>
-              <w:jc w:val="center"/>
-            </w:pPr>
-            <w:r>
-              <w:rPr>
-                <w:rFonts w:ascii="Arial" w:hAnsi="Arial"/>
-                <w:b w:val="0"/>
-                <w:i w:val="0"/>
-                <w:sz w:val="18"/>
-              </w:rPr>
-              <w:t>NUEVA PROSPERINA</w:t>
-            </w:r>
-          </w:p>
-        </w:tc>
-        <w:tc>
-          <w:tcPr>
-            <w:tcW w:type="dxa" w:w="2160"/>
-            <w:shd w:fill="FFFFFF"/>
-            <w:tcMar>
-              <w:top w:w="100" w:type="dxa"/>
-              <w:bottom w:w="100" w:type="dxa"/>
-              <w:left w:w="150" w:type="dxa"/>
-              <w:right w:w="150" w:type="dxa"/>
-            </w:tcMar>
-          </w:tcPr>
-          <w:p>
-            <w:pPr>
-              <w:spacing w:after="0" w:before="0"/>
-              <w:jc w:val="center"/>
-            </w:pPr>
-            <w:r>
-              <w:rPr>
-                <w:rFonts w:ascii="Arial" w:hAnsi="Arial"/>
-                <w:b w:val="0"/>
-                <w:i w:val="0"/>
-                <w:sz w:val="18"/>
-              </w:rPr>
-              <w:t>16.49</w:t>
-            </w:r>
-          </w:p>
-        </w:tc>
-        <w:tc>
-          <w:tcPr>
-            <w:tcW w:type="dxa" w:w="1440"/>
-            <w:shd w:fill="FFFFFF"/>
-            <w:tcMar>
-              <w:top w:w="100" w:type="dxa"/>
-              <w:bottom w:w="100" w:type="dxa"/>
-              <w:left w:w="150" w:type="dxa"/>
-              <w:right w:w="150" w:type="dxa"/>
-            </w:tcMar>
-          </w:tcPr>
-          <w:p>
-            <w:pPr>
-              <w:spacing w:after="0" w:before="0"/>
-              <w:jc w:val="center"/>
-            </w:pPr>
-            <w:r>
-              <w:rPr>
-                <w:rFonts w:ascii="Arial" w:hAnsi="Arial"/>
-                <w:b w:val="0"/>
-                <w:i w:val="0"/>
-                <w:sz w:val="18"/>
-              </w:rPr>
-              <w:t>1.00</w:t>
-            </w:r>
-          </w:p>
-        </w:tc>
-      </w:tr>
-      <w:tr>
-        <w:tc>
-          <w:tcPr>
-            <w:tcW w:type="dxa" w:w="2880"/>
-            <w:shd w:fill="F9F9F9"/>
-            <w:tcMar>
-              <w:top w:w="100" w:type="dxa"/>
-              <w:bottom w:w="100" w:type="dxa"/>
-              <w:left w:w="150" w:type="dxa"/>
-              <w:right w:w="150" w:type="dxa"/>
-            </w:tcMar>
-          </w:tcPr>
-          <w:p>
-            <w:pPr>
-              <w:spacing w:after="0" w:before="0"/>
-              <w:jc w:val="center"/>
-            </w:pPr>
-            <w:r>
-              <w:rPr>
-                <w:rFonts w:ascii="Arial" w:hAnsi="Arial"/>
-                <w:b w:val="0"/>
-                <w:i w:val="0"/>
-                <w:sz w:val="18"/>
-              </w:rPr>
-              <w:t>MALVINAS SUR 2</w:t>
-            </w:r>
-          </w:p>
-        </w:tc>
-        <w:tc>
-          <w:tcPr>
-            <w:tcW w:type="dxa" w:w="2160"/>
-            <w:shd w:fill="F9F9F9"/>
-            <w:tcMar>
-              <w:top w:w="100" w:type="dxa"/>
-              <w:bottom w:w="100" w:type="dxa"/>
-              <w:left w:w="150" w:type="dxa"/>
-              <w:right w:w="150" w:type="dxa"/>
-            </w:tcMar>
-          </w:tcPr>
-          <w:p>
-            <w:pPr>
-              <w:spacing w:after="0" w:before="0"/>
-              <w:jc w:val="center"/>
-            </w:pPr>
-            <w:r>
-              <w:rPr>
-                <w:rFonts w:ascii="Arial" w:hAnsi="Arial"/>
-                <w:b w:val="0"/>
-                <w:i w:val="0"/>
-                <w:sz w:val="18"/>
-              </w:rPr>
-              <w:t>MALVINAS SUR</w:t>
-            </w:r>
-          </w:p>
-        </w:tc>
-        <w:tc>
-          <w:tcPr>
-            <w:tcW w:type="dxa" w:w="2160"/>
-            <w:shd w:fill="F9F9F9"/>
-            <w:tcMar>
-              <w:top w:w="100" w:type="dxa"/>
-              <w:bottom w:w="100" w:type="dxa"/>
-              <w:left w:w="150" w:type="dxa"/>
-              <w:right w:w="150" w:type="dxa"/>
-            </w:tcMar>
-          </w:tcPr>
-          <w:p>
-            <w:pPr>
-              <w:spacing w:after="0" w:before="0"/>
-              <w:jc w:val="center"/>
-            </w:pPr>
-            <w:r>
-              <w:rPr>
-                <w:rFonts w:ascii="Arial" w:hAnsi="Arial"/>
-                <w:b w:val="0"/>
-                <w:i w:val="0"/>
-                <w:sz w:val="18"/>
-              </w:rPr>
-              <w:t>ESTEROS</w:t>
-            </w:r>
-          </w:p>
-        </w:tc>
-        <w:tc>
-          <w:tcPr>
-            <w:tcW w:type="dxa" w:w="2160"/>
-            <w:shd w:fill="F9F9F9"/>
-            <w:tcMar>
-              <w:top w:w="100" w:type="dxa"/>
-              <w:bottom w:w="100" w:type="dxa"/>
-              <w:left w:w="150" w:type="dxa"/>
-              <w:right w:w="150" w:type="dxa"/>
-            </w:tcMar>
-          </w:tcPr>
-          <w:p>
-            <w:pPr>
-              <w:spacing w:after="0" w:before="0"/>
-              <w:jc w:val="center"/>
-            </w:pPr>
-            <w:r>
-              <w:rPr>
-                <w:rFonts w:ascii="Arial" w:hAnsi="Arial"/>
-                <w:b w:val="0"/>
-                <w:i w:val="0"/>
-                <w:sz w:val="18"/>
-              </w:rPr>
-              <w:t>15.59</w:t>
-            </w:r>
-          </w:p>
-        </w:tc>
-        <w:tc>
-          <w:tcPr>
-            <w:tcW w:type="dxa" w:w="1440"/>
-            <w:shd w:fill="F9F9F9"/>
-            <w:tcMar>
-              <w:top w:w="100" w:type="dxa"/>
-              <w:bottom w:w="100" w:type="dxa"/>
-              <w:left w:w="150" w:type="dxa"/>
-              <w:right w:w="150" w:type="dxa"/>
-            </w:tcMar>
-          </w:tcPr>
-          <w:p>
-            <w:pPr>
-              <w:spacing w:after="0" w:before="0"/>
-              <w:jc w:val="center"/>
-            </w:pPr>
-            <w:r>
-              <w:rPr>
-                <w:rFonts w:ascii="Arial" w:hAnsi="Arial"/>
-                <w:b w:val="0"/>
-                <w:i w:val="0"/>
-                <w:sz w:val="18"/>
-              </w:rPr>
-              <w:t>1.00</w:t>
-            </w:r>
-          </w:p>
-        </w:tc>
-      </w:tr>
-      <w:tr>
-        <w:tc>
-          <w:tcPr>
-            <w:tcW w:type="dxa" w:w="2880"/>
-            <w:shd w:fill="FFFFFF"/>
-            <w:tcMar>
-              <w:top w:w="100" w:type="dxa"/>
-              <w:bottom w:w="100" w:type="dxa"/>
-              <w:left w:w="150" w:type="dxa"/>
-              <w:right w:w="150" w:type="dxa"/>
-            </w:tcMar>
-          </w:tcPr>
-          <w:p>
-            <w:pPr>
-              <w:spacing w:after="0" w:before="0"/>
-              <w:jc w:val="center"/>
-            </w:pPr>
-            <w:r>
-              <w:rPr>
-                <w:rFonts w:ascii="Arial" w:hAnsi="Arial"/>
-                <w:b w:val="0"/>
-                <w:i w:val="0"/>
-                <w:sz w:val="18"/>
-              </w:rPr>
-              <w:t>TRINITARIA SUR 5</w:t>
-            </w:r>
-          </w:p>
-        </w:tc>
-        <w:tc>
-          <w:tcPr>
-            <w:tcW w:type="dxa" w:w="2160"/>
-            <w:shd w:fill="FFFFFF"/>
-            <w:tcMar>
-              <w:top w:w="100" w:type="dxa"/>
-              <w:bottom w:w="100" w:type="dxa"/>
-              <w:left w:w="150" w:type="dxa"/>
-              <w:right w:w="150" w:type="dxa"/>
-            </w:tcMar>
-          </w:tcPr>
-          <w:p>
-            <w:pPr>
-              <w:spacing w:after="0" w:before="0"/>
-              <w:jc w:val="center"/>
-            </w:pPr>
-            <w:r>
-              <w:rPr>
-                <w:rFonts w:ascii="Arial" w:hAnsi="Arial"/>
-                <w:b w:val="0"/>
-                <w:i w:val="0"/>
-                <w:sz w:val="18"/>
-              </w:rPr>
-              <w:t>TRINITARIA SUR</w:t>
             </w:r>
           </w:p>
         </w:tc>
@@ -4090,7 +4347,7 @@
                 <w:i w:val="0"/>
                 <w:sz w:val="18"/>
               </w:rPr>
-              <w:t>14.51</w:t>
+              <w:t>3.24</w:t>
             </w:r>
           </w:p>
         </w:tc>
@@ -4117,7 +4374,7 @@
                 <w:i w:val="0"/>
                 <w:sz w:val="18"/>
               </w:rPr>
-              <w:t>0.9983</w:t>
+              <w:t>0.9915</w:t>
             </w:r>
           </w:p>
         </w:tc>
@@ -4146,7 +4403,7 @@
                 <w:i w:val="0"/>
                 <w:sz w:val="18"/>
               </w:rPr>
-              <w:t>MALVINAS SUR 3</w:t>
+              <w:t>PASCUALES 3</w:t>
             </w:r>
           </w:p>
         </w:tc>
@@ -4173,7 +4430,7 @@
                 <w:i w:val="0"/>
                 <w:sz w:val="18"/>
               </w:rPr>
-              <w:t>MALVINAS SUR</w:t>
+              <w:t>PASCUALES</w:t>
             </w:r>
           </w:p>
         </w:tc>
@@ -4200,7 +4457,7 @@
                 <w:i w:val="0"/>
                 <w:sz w:val="18"/>
               </w:rPr>
-              <w:t>ESTEROS</w:t>
+              <w:t>PASCUALES</w:t>
             </w:r>
           </w:p>
         </w:tc>
@@ -4227,7 +4484,7 @@
                 <w:i w:val="0"/>
                 <w:sz w:val="18"/>
               </w:rPr>
-              <w:t>14.37</w:t>
+              <w:t>3.06</w:t>
             </w:r>
           </w:p>
         </w:tc>
@@ -4254,7 +4511,281 @@
                 <w:i w:val="0"/>
                 <w:sz w:val="18"/>
               </w:rPr>
-              <w:t>0.9967</w:t>
+              <w:t>0.9945</w:t>
+            </w:r>
+          </w:p>
+        </w:tc>
+      </w:tr>
+      <w:tr>
+        <w:tc>
+          <w:tcPr>
+            <w:tcW w:type="dxa" w:w="2880"/>
+            <w:shd w:fill="FFFFFF"/>
+            <w:tcMar>
+              <w:top w:w="100" w:type="dxa"/>
+              <w:bottom w:w="100" w:type="dxa"/>
+              <w:left w:w="150" w:type="dxa"/>
+              <w:right w:w="150" w:type="dxa"/>
+            </w:tcMar>
+          </w:tcPr>
+          <w:p>
+            <w:pPr>
+              <w:spacing w:after="0" w:before="0"/>
+              <w:jc w:val="center"/>
+            </w:pPr>
+            <w:r>
+              <w:rPr>
+                <w:rFonts w:ascii="Arial" w:hAnsi="Arial"/>
+                <w:b w:val="0"/>
+                <w:i w:val="0"/>
+                <w:sz w:val="18"/>
+              </w:rPr>
+              <w:t>7 LAGOS 3</w:t>
+            </w:r>
+          </w:p>
+        </w:tc>
+        <w:tc>
+          <w:tcPr>
+            <w:tcW w:type="dxa" w:w="2160"/>
+            <w:shd w:fill="FFFFFF"/>
+            <w:tcMar>
+              <w:top w:w="100" w:type="dxa"/>
+              <w:bottom w:w="100" w:type="dxa"/>
+              <w:left w:w="150" w:type="dxa"/>
+              <w:right w:w="150" w:type="dxa"/>
+            </w:tcMar>
+          </w:tcPr>
+          <w:p>
+            <w:pPr>
+              <w:spacing w:after="0" w:before="0"/>
+              <w:jc w:val="center"/>
+            </w:pPr>
+            <w:r>
+              <w:rPr>
+                <w:rFonts w:ascii="Arial" w:hAnsi="Arial"/>
+                <w:b w:val="0"/>
+                <w:i w:val="0"/>
+                <w:sz w:val="18"/>
+              </w:rPr>
+              <w:t>7 LAGOS</w:t>
+            </w:r>
+          </w:p>
+        </w:tc>
+        <w:tc>
+          <w:tcPr>
+            <w:tcW w:type="dxa" w:w="2160"/>
+            <w:shd w:fill="FFFFFF"/>
+            <w:tcMar>
+              <w:top w:w="100" w:type="dxa"/>
+              <w:bottom w:w="100" w:type="dxa"/>
+              <w:left w:w="150" w:type="dxa"/>
+              <w:right w:w="150" w:type="dxa"/>
+            </w:tcMar>
+          </w:tcPr>
+          <w:p>
+            <w:pPr>
+              <w:spacing w:after="0" w:before="0"/>
+              <w:jc w:val="center"/>
+            </w:pPr>
+            <w:r>
+              <w:rPr>
+                <w:rFonts w:ascii="Arial" w:hAnsi="Arial"/>
+                <w:b w:val="0"/>
+                <w:i w:val="0"/>
+                <w:sz w:val="18"/>
+              </w:rPr>
+              <w:t>SUR</w:t>
+            </w:r>
+          </w:p>
+        </w:tc>
+        <w:tc>
+          <w:tcPr>
+            <w:tcW w:type="dxa" w:w="2160"/>
+            <w:shd w:fill="FFFFFF"/>
+            <w:tcMar>
+              <w:top w:w="100" w:type="dxa"/>
+              <w:bottom w:w="100" w:type="dxa"/>
+              <w:left w:w="150" w:type="dxa"/>
+              <w:right w:w="150" w:type="dxa"/>
+            </w:tcMar>
+          </w:tcPr>
+          <w:p>
+            <w:pPr>
+              <w:spacing w:after="0" w:before="0"/>
+              <w:jc w:val="center"/>
+            </w:pPr>
+            <w:r>
+              <w:rPr>
+                <w:rFonts w:ascii="Arial" w:hAnsi="Arial"/>
+                <w:b w:val="0"/>
+                <w:i w:val="0"/>
+                <w:sz w:val="18"/>
+              </w:rPr>
+              <w:t>2.95</w:t>
+            </w:r>
+          </w:p>
+        </w:tc>
+        <w:tc>
+          <w:tcPr>
+            <w:tcW w:type="dxa" w:w="1440"/>
+            <w:shd w:fill="FFFFFF"/>
+            <w:tcMar>
+              <w:top w:w="100" w:type="dxa"/>
+              <w:bottom w:w="100" w:type="dxa"/>
+              <w:left w:w="150" w:type="dxa"/>
+              <w:right w:w="150" w:type="dxa"/>
+            </w:tcMar>
+          </w:tcPr>
+          <w:p>
+            <w:pPr>
+              <w:spacing w:after="0" w:before="0"/>
+              <w:jc w:val="center"/>
+            </w:pPr>
+            <w:r>
+              <w:rPr>
+                <w:rFonts w:ascii="Arial" w:hAnsi="Arial"/>
+                <w:b w:val="0"/>
+                <w:i w:val="0"/>
+                <w:sz w:val="18"/>
+              </w:rPr>
+              <w:t>0.9925</w:t>
+            </w:r>
+          </w:p>
+        </w:tc>
+      </w:tr>
+      <w:tr>
+        <w:tc>
+          <w:tcPr>
+            <w:tcW w:type="dxa" w:w="2880"/>
+            <w:shd w:fill="F9F9F9"/>
+            <w:tcMar>
+              <w:top w:w="100" w:type="dxa"/>
+              <w:bottom w:w="100" w:type="dxa"/>
+              <w:left w:w="150" w:type="dxa"/>
+              <w:right w:w="150" w:type="dxa"/>
+            </w:tcMar>
+          </w:tcPr>
+          <w:p>
+            <w:pPr>
+              <w:spacing w:after="0" w:before="0"/>
+              <w:jc w:val="center"/>
+            </w:pPr>
+            <w:r>
+              <w:rPr>
+                <w:rFonts w:ascii="Arial" w:hAnsi="Arial"/>
+                <w:b w:val="0"/>
+                <w:i w:val="0"/>
+                <w:sz w:val="18"/>
+              </w:rPr>
+              <w:t>FLORESTA 2</w:t>
+            </w:r>
+          </w:p>
+        </w:tc>
+        <w:tc>
+          <w:tcPr>
+            <w:tcW w:type="dxa" w:w="2160"/>
+            <w:shd w:fill="F9F9F9"/>
+            <w:tcMar>
+              <w:top w:w="100" w:type="dxa"/>
+              <w:bottom w:w="100" w:type="dxa"/>
+              <w:left w:w="150" w:type="dxa"/>
+              <w:right w:w="150" w:type="dxa"/>
+            </w:tcMar>
+          </w:tcPr>
+          <w:p>
+            <w:pPr>
+              <w:spacing w:after="0" w:before="0"/>
+              <w:jc w:val="center"/>
+            </w:pPr>
+            <w:r>
+              <w:rPr>
+                <w:rFonts w:ascii="Arial" w:hAnsi="Arial"/>
+                <w:b w:val="0"/>
+                <w:i w:val="0"/>
+                <w:sz w:val="18"/>
+              </w:rPr>
+              <w:t>FLORESTA</w:t>
+            </w:r>
+          </w:p>
+        </w:tc>
+        <w:tc>
+          <w:tcPr>
+            <w:tcW w:type="dxa" w:w="2160"/>
+            <w:shd w:fill="F9F9F9"/>
+            <w:tcMar>
+              <w:top w:w="100" w:type="dxa"/>
+              <w:bottom w:w="100" w:type="dxa"/>
+              <w:left w:w="150" w:type="dxa"/>
+              <w:right w:w="150" w:type="dxa"/>
+            </w:tcMar>
+          </w:tcPr>
+          <w:p>
+            <w:pPr>
+              <w:spacing w:after="0" w:before="0"/>
+              <w:jc w:val="center"/>
+            </w:pPr>
+            <w:r>
+              <w:rPr>
+                <w:rFonts w:ascii="Arial" w:hAnsi="Arial"/>
+                <w:b w:val="0"/>
+                <w:i w:val="0"/>
+                <w:sz w:val="18"/>
+              </w:rPr>
+              <w:t>SUR</w:t>
+            </w:r>
+          </w:p>
+        </w:tc>
+        <w:tc>
+          <w:tcPr>
+            <w:tcW w:type="dxa" w:w="2160"/>
+            <w:shd w:fill="F9F9F9"/>
+            <w:tcMar>
+              <w:top w:w="100" w:type="dxa"/>
+              <w:bottom w:w="100" w:type="dxa"/>
+              <w:left w:w="150" w:type="dxa"/>
+              <w:right w:w="150" w:type="dxa"/>
+            </w:tcMar>
+          </w:tcPr>
+          <w:p>
+            <w:pPr>
+              <w:spacing w:after="0" w:before="0"/>
+              <w:jc w:val="center"/>
+            </w:pPr>
+            <w:r>
+              <w:rPr>
+                <w:rFonts w:ascii="Arial" w:hAnsi="Arial"/>
+                <w:b w:val="0"/>
+                <w:i w:val="0"/>
+                <w:sz w:val="18"/>
+              </w:rPr>
+              <w:t>2.90</w:t>
+            </w:r>
+          </w:p>
+        </w:tc>
+        <w:tc>
+          <w:tcPr>
+            <w:tcW w:type="dxa" w:w="1440"/>
+            <w:shd w:fill="F9F9F9"/>
+            <w:tcMar>
+              <w:top w:w="100" w:type="dxa"/>
+              <w:bottom w:w="100" w:type="dxa"/>
+              <w:left w:w="150" w:type="dxa"/>
+              <w:right w:w="150" w:type="dxa"/>
+            </w:tcMar>
+          </w:tcPr>
+          <w:p>
+            <w:pPr>
+              <w:spacing w:after="0" w:before="0"/>
+              <w:jc w:val="center"/>
+            </w:pPr>
+            <w:r>
+              <w:rPr>
+                <w:rFonts w:ascii="Arial" w:hAnsi="Arial"/>
+                <w:b w:val="0"/>
+                <w:i w:val="0"/>
+                <w:sz w:val="18"/>
+              </w:rPr>
+              <w:t>0.9882</w:t>
             </w:r>
           </w:p>
         </w:tc>
@@ -4390,7 +4921,7 @@
                 <w:i w:val="0"/>
                 <w:sz w:val="18"/>
               </w:rPr>
-              <w:t>HOTSPOT PERSISTENTE</w:t>
+              <w:t>ESTABLE / BAJO RIESGO</w:t>
             </w:r>
           </w:p>
         </w:tc>
@@ -4417,7 +4948,7 @@
                 <w:i w:val="0"/>
                 <w:sz w:val="18"/>
               </w:rPr>
-              <w:t>226</w:t>
+              <w:t>173</w:t>
             </w:r>
           </w:p>
         </w:tc>
@@ -4446,7 +4977,7 @@
                 <w:i w:val="0"/>
                 <w:sz w:val="18"/>
               </w:rPr>
-              <w:t>HOTSPOT EN DECLIVE</w:t>
+              <w:t>HOTSPOT PERSISTENTE</w:t>
             </w:r>
           </w:p>
         </w:tc>
@@ -4473,7 +5004,375 @@
                 <w:i w:val="0"/>
                 <w:sz w:val="18"/>
               </w:rPr>
-              <w:t>10</w:t>
+              <w:t>71</w:t>
+            </w:r>
+          </w:p>
+        </w:tc>
+      </w:tr>
+    </w:tbl>
+    <w:p>
+      <w:pPr>
+        <w:spacing w:before="240"/>
+      </w:pPr>
+    </w:p>
+    <w:p>
+      <w:r>
+        <w:rPr>
+          <w:rFonts w:ascii="Arial" w:hAnsi="Arial"/>
+          <w:b/>
+          <w:i w:val="0"/>
+          <w:sz w:val="20"/>
+        </w:rPr>
+        <w:t>Tabla 8:</w:t>
+      </w:r>
+    </w:p>
+    <w:p>
+      <w:pPr>
+        <w:spacing w:after="120"/>
+      </w:pPr>
+      <w:r>
+        <w:rPr>
+          <w:rFonts w:ascii="Arial" w:hAnsi="Arial"/>
+          <w:b w:val="0"/>
+          <w:i/>
+          <w:sz w:val="20"/>
+        </w:rPr>
+        <w:t>Comparación de Modelos Bayesianos mediante Validación Cruzada LOO-CV (Escala Log ELPD)</w:t>
+      </w:r>
+    </w:p>
+    <w:tbl>
+      <w:tblPr>
+        <w:tblW w:type="auto" w:w="0"/>
+        <w:jc w:val="center"/>
+        <w:tblLook w:firstColumn="1" w:firstRow="1" w:lastColumn="0" w:lastRow="0" w:noHBand="0" w:noVBand="1" w:val="04A0"/>
+        <w:tblBorders>
+          <w:top w:val="single" w:sz="6" w:space="0" w:color="000000"/>
+          <w:bottom w:val="single" w:sz="6" w:space="0" w:color="000000"/>
+          <w:left w:val="none"/>
+          <w:right w:val="none"/>
+          <w:insideH w:val="single" w:sz="4" w:space="0" w:color="D3D3D3"/>
+          <w:insideV w:val="none"/>
+        </w:tblBorders>
+      </w:tblPr>
+      <w:tblGrid>
+        <w:gridCol w:w="851"/>
+        <w:gridCol w:w="851"/>
+        <w:gridCol w:w="851"/>
+        <w:gridCol w:w="851"/>
+        <w:gridCol w:w="851"/>
+        <w:gridCol w:w="851"/>
+        <w:gridCol w:w="851"/>
+        <w:gridCol w:w="851"/>
+        <w:gridCol w:w="851"/>
+        <w:gridCol w:w="851"/>
+        <w:gridCol w:w="851"/>
+      </w:tblGrid>
+      <w:tr>
+        <w:tc>
+          <w:tcPr>
+            <w:tcW w:type="dxa" w:w="851"/>
+            <w:shd w:fill="333333"/>
+            <w:tcMar>
+              <w:top w:w="120" w:type="dxa"/>
+              <w:bottom w:w="120" w:type="dxa"/>
+              <w:left w:w="150" w:type="dxa"/>
+              <w:right w:w="150" w:type="dxa"/>
+            </w:tcMar>
+          </w:tcPr>
+          <w:p>
+            <w:pPr>
+              <w:spacing w:after="0" w:before="0"/>
+              <w:jc w:val="center"/>
+            </w:pPr>
+            <w:r>
+              <w:rPr>
+                <w:rFonts w:ascii="Arial" w:hAnsi="Arial"/>
+                <w:b/>
+                <w:i w:val="0"/>
+                <w:color w:val="FFFFFF"/>
+                <w:sz w:val="19"/>
+              </w:rPr>
+              <w:t>Modelo</w:t>
+            </w:r>
+          </w:p>
+        </w:tc>
+        <w:tc>
+          <w:tcPr>
+            <w:tcW w:type="dxa" w:w="851"/>
+            <w:shd w:fill="333333"/>
+            <w:tcMar>
+              <w:top w:w="120" w:type="dxa"/>
+              <w:bottom w:w="120" w:type="dxa"/>
+              <w:left w:w="150" w:type="dxa"/>
+              <w:right w:w="150" w:type="dxa"/>
+            </w:tcMar>
+          </w:tcPr>
+          <w:p>
+            <w:pPr>
+              <w:spacing w:after="0" w:before="0"/>
+              <w:jc w:val="center"/>
+            </w:pPr>
+            <w:r>
+              <w:rPr>
+                <w:rFonts w:ascii="Arial" w:hAnsi="Arial"/>
+                <w:b/>
+                <w:i w:val="0"/>
+                <w:color w:val="FFFFFF"/>
+                <w:sz w:val="19"/>
+              </w:rPr>
+              <w:t>rank</w:t>
+            </w:r>
+          </w:p>
+        </w:tc>
+        <w:tc>
+          <w:tcPr>
+            <w:tcW w:type="dxa" w:w="851"/>
+            <w:shd w:fill="333333"/>
+            <w:tcMar>
+              <w:top w:w="120" w:type="dxa"/>
+              <w:bottom w:w="120" w:type="dxa"/>
+              <w:left w:w="150" w:type="dxa"/>
+              <w:right w:w="150" w:type="dxa"/>
+            </w:tcMar>
+          </w:tcPr>
+          <w:p>
+            <w:pPr>
+              <w:spacing w:after="0" w:before="0"/>
+              <w:jc w:val="center"/>
+            </w:pPr>
+            <w:r>
+              <w:rPr>
+                <w:rFonts w:ascii="Arial" w:hAnsi="Arial"/>
+                <w:b/>
+                <w:i w:val="0"/>
+                <w:color w:val="FFFFFF"/>
+                <w:sz w:val="19"/>
+              </w:rPr>
+              <w:t>elpd_loo</w:t>
+            </w:r>
+          </w:p>
+        </w:tc>
+        <w:tc>
+          <w:tcPr>
+            <w:tcW w:type="dxa" w:w="851"/>
+            <w:shd w:fill="333333"/>
+            <w:tcMar>
+              <w:top w:w="120" w:type="dxa"/>
+              <w:bottom w:w="120" w:type="dxa"/>
+              <w:left w:w="150" w:type="dxa"/>
+              <w:right w:w="150" w:type="dxa"/>
+            </w:tcMar>
+          </w:tcPr>
+          <w:p>
+            <w:pPr>
+              <w:spacing w:after="0" w:before="0"/>
+              <w:jc w:val="center"/>
+            </w:pPr>
+            <w:r>
+              <w:rPr>
+                <w:rFonts w:ascii="Arial" w:hAnsi="Arial"/>
+                <w:b/>
+                <w:i w:val="0"/>
+                <w:color w:val="FFFFFF"/>
+                <w:sz w:val="19"/>
+              </w:rPr>
+              <w:t>p_loo</w:t>
+            </w:r>
+          </w:p>
+        </w:tc>
+        <w:tc>
+          <w:tcPr>
+            <w:tcW w:type="dxa" w:w="851"/>
+            <w:shd w:fill="333333"/>
+            <w:tcMar>
+              <w:top w:w="120" w:type="dxa"/>
+              <w:bottom w:w="120" w:type="dxa"/>
+              <w:left w:w="150" w:type="dxa"/>
+              <w:right w:w="150" w:type="dxa"/>
+            </w:tcMar>
+          </w:tcPr>
+          <w:p>
+            <w:pPr>
+              <w:spacing w:after="0" w:before="0"/>
+              <w:jc w:val="center"/>
+            </w:pPr>
+            <w:r>
+              <w:rPr>
+                <w:rFonts w:ascii="Arial" w:hAnsi="Arial"/>
+                <w:b/>
+                <w:i w:val="0"/>
+                <w:color w:val="FFFFFF"/>
+                <w:sz w:val="19"/>
+              </w:rPr>
+              <w:t>elpd_diff</w:t>
+            </w:r>
+          </w:p>
+        </w:tc>
+        <w:tc>
+          <w:tcPr>
+            <w:tcW w:type="dxa" w:w="851"/>
+            <w:shd w:fill="333333"/>
+            <w:tcMar>
+              <w:top w:w="120" w:type="dxa"/>
+              <w:bottom w:w="120" w:type="dxa"/>
+              <w:left w:w="150" w:type="dxa"/>
+              <w:right w:w="150" w:type="dxa"/>
+            </w:tcMar>
+          </w:tcPr>
+          <w:p>
+            <w:pPr>
+              <w:spacing w:after="0" w:before="0"/>
+              <w:jc w:val="center"/>
+            </w:pPr>
+            <w:r>
+              <w:rPr>
+                <w:rFonts w:ascii="Arial" w:hAnsi="Arial"/>
+                <w:b/>
+                <w:i w:val="0"/>
+                <w:color w:val="FFFFFF"/>
+                <w:sz w:val="19"/>
+              </w:rPr>
+              <w:t>weight</w:t>
+            </w:r>
+          </w:p>
+        </w:tc>
+        <w:tc>
+          <w:tcPr>
+            <w:tcW w:type="dxa" w:w="851"/>
+            <w:shd w:fill="333333"/>
+            <w:tcMar>
+              <w:top w:w="120" w:type="dxa"/>
+              <w:bottom w:w="120" w:type="dxa"/>
+              <w:left w:w="150" w:type="dxa"/>
+              <w:right w:w="150" w:type="dxa"/>
+            </w:tcMar>
+          </w:tcPr>
+          <w:p>
+            <w:pPr>
+              <w:spacing w:after="0" w:before="0"/>
+              <w:jc w:val="center"/>
+            </w:pPr>
+            <w:r>
+              <w:rPr>
+                <w:rFonts w:ascii="Arial" w:hAnsi="Arial"/>
+                <w:b/>
+                <w:i w:val="0"/>
+                <w:color w:val="FFFFFF"/>
+                <w:sz w:val="19"/>
+              </w:rPr>
+              <w:t>se</w:t>
+            </w:r>
+          </w:p>
+        </w:tc>
+        <w:tc>
+          <w:tcPr>
+            <w:tcW w:type="dxa" w:w="851"/>
+            <w:shd w:fill="333333"/>
+            <w:tcMar>
+              <w:top w:w="120" w:type="dxa"/>
+              <w:bottom w:w="120" w:type="dxa"/>
+              <w:left w:w="150" w:type="dxa"/>
+              <w:right w:w="150" w:type="dxa"/>
+            </w:tcMar>
+          </w:tcPr>
+          <w:p>
+            <w:pPr>
+              <w:spacing w:after="0" w:before="0"/>
+              <w:jc w:val="center"/>
+            </w:pPr>
+            <w:r>
+              <w:rPr>
+                <w:rFonts w:ascii="Arial" w:hAnsi="Arial"/>
+                <w:b/>
+                <w:i w:val="0"/>
+                <w:color w:val="FFFFFF"/>
+                <w:sz w:val="19"/>
+              </w:rPr>
+              <w:t>dse</w:t>
+            </w:r>
+          </w:p>
+        </w:tc>
+        <w:tc>
+          <w:tcPr>
+            <w:tcW w:type="dxa" w:w="851"/>
+            <w:shd w:fill="333333"/>
+            <w:tcMar>
+              <w:top w:w="120" w:type="dxa"/>
+              <w:bottom w:w="120" w:type="dxa"/>
+              <w:left w:w="150" w:type="dxa"/>
+              <w:right w:w="150" w:type="dxa"/>
+            </w:tcMar>
+          </w:tcPr>
+          <w:p>
+            <w:pPr>
+              <w:spacing w:after="0" w:before="0"/>
+              <w:jc w:val="center"/>
+            </w:pPr>
+            <w:r>
+              <w:rPr>
+                <w:rFonts w:ascii="Arial" w:hAnsi="Arial"/>
+                <w:b/>
+                <w:i w:val="0"/>
+                <w:color w:val="FFFFFF"/>
+                <w:sz w:val="19"/>
+              </w:rPr>
+              <w:t>warning</w:t>
+            </w:r>
+          </w:p>
+        </w:tc>
+        <w:tc>
+          <w:tcPr>
+            <w:tcW w:type="dxa" w:w="851"/>
+            <w:shd w:fill="333333"/>
+            <w:tcMar>
+              <w:top w:w="120" w:type="dxa"/>
+              <w:bottom w:w="120" w:type="dxa"/>
+              <w:left w:w="150" w:type="dxa"/>
+              <w:right w:w="150" w:type="dxa"/>
+            </w:tcMar>
+          </w:tcPr>
+          <w:p>
+            <w:pPr>
+              <w:spacing w:after="0" w:before="0"/>
+              <w:jc w:val="center"/>
+            </w:pPr>
+            <w:r>
+              <w:rPr>
+                <w:rFonts w:ascii="Arial" w:hAnsi="Arial"/>
+                <w:b/>
+                <w:i w:val="0"/>
+                <w:color w:val="FFFFFF"/>
+                <w:sz w:val="19"/>
+              </w:rPr>
+              <w:t>scale</w:t>
+            </w:r>
+          </w:p>
+        </w:tc>
+        <w:tc>
+          <w:tcPr>
+            <w:tcW w:type="dxa" w:w="851"/>
+            <w:shd w:fill="333333"/>
+            <w:tcMar>
+              <w:top w:w="120" w:type="dxa"/>
+              <w:bottom w:w="120" w:type="dxa"/>
+              <w:left w:w="150" w:type="dxa"/>
+              <w:right w:w="150" w:type="dxa"/>
+            </w:tcMar>
+          </w:tcPr>
+          <w:p>
+            <w:pPr>
+              <w:spacing w:after="0" w:before="0"/>
+              <w:jc w:val="center"/>
+            </w:pPr>
+            <w:r>
+              <w:rPr>
+                <w:rFonts w:ascii="Arial" w:hAnsi="Arial"/>
+                <w:b/>
+                <w:i w:val="0"/>
+                <w:color w:val="FFFFFF"/>
+                <w:sz w:val="19"/>
+              </w:rPr>
+              <w:t>Diagnóstico Pareto-k</w:t>
             </w:r>
           </w:p>
         </w:tc>
@@ -4481,7 +5380,7 @@
       <w:tr>
         <w:tc>
           <w:tcPr>
-            <w:tcW w:type="dxa" w:w="5040"/>
+            <w:tcW w:type="dxa" w:w="851"/>
             <w:shd w:fill="FFFFFF"/>
             <w:tcMar>
               <w:top w:w="100" w:type="dxa"/>
@@ -4502,13 +5401,13 @@
                 <w:i w:val="0"/>
                 <w:sz w:val="18"/>
               </w:rPr>
-              <w:t>ESTABLE / BAJO RIESGO</w:t>
+              <w:t>BYM2 Binomial Negativo (Prior PC)</w:t>
             </w:r>
           </w:p>
         </w:tc>
         <w:tc>
           <w:tcPr>
-            <w:tcW w:type="dxa" w:w="2880"/>
+            <w:tcW w:type="dxa" w:w="851"/>
             <w:shd w:fill="FFFFFF"/>
             <w:tcMar>
               <w:top w:w="100" w:type="dxa"/>
@@ -4529,7 +5428,1147 @@
                 <w:i w:val="0"/>
                 <w:sz w:val="18"/>
               </w:rPr>
-              <w:t>8</w:t>
+              <w:t>0</w:t>
+            </w:r>
+          </w:p>
+        </w:tc>
+        <w:tc>
+          <w:tcPr>
+            <w:tcW w:type="dxa" w:w="851"/>
+            <w:shd w:fill="FFFFFF"/>
+            <w:tcMar>
+              <w:top w:w="100" w:type="dxa"/>
+              <w:bottom w:w="100" w:type="dxa"/>
+              <w:left w:w="150" w:type="dxa"/>
+              <w:right w:w="150" w:type="dxa"/>
+            </w:tcMar>
+          </w:tcPr>
+          <w:p>
+            <w:pPr>
+              <w:spacing w:after="0" w:before="0"/>
+              <w:jc w:val="center"/>
+            </w:pPr>
+            <w:r>
+              <w:rPr>
+                <w:rFonts w:ascii="Arial" w:hAnsi="Arial"/>
+                <w:b w:val="0"/>
+                <w:i w:val="0"/>
+                <w:sz w:val="18"/>
+              </w:rPr>
+              <w:t>-1321.2723</w:t>
+            </w:r>
+          </w:p>
+        </w:tc>
+        <w:tc>
+          <w:tcPr>
+            <w:tcW w:type="dxa" w:w="851"/>
+            <w:shd w:fill="FFFFFF"/>
+            <w:tcMar>
+              <w:top w:w="100" w:type="dxa"/>
+              <w:bottom w:w="100" w:type="dxa"/>
+              <w:left w:w="150" w:type="dxa"/>
+              <w:right w:w="150" w:type="dxa"/>
+            </w:tcMar>
+          </w:tcPr>
+          <w:p>
+            <w:pPr>
+              <w:spacing w:after="0" w:before="0"/>
+              <w:jc w:val="center"/>
+            </w:pPr>
+            <w:r>
+              <w:rPr>
+                <w:rFonts w:ascii="Arial" w:hAnsi="Arial"/>
+                <w:b w:val="0"/>
+                <w:i w:val="0"/>
+                <w:sz w:val="18"/>
+              </w:rPr>
+              <w:t>167.76</w:t>
+            </w:r>
+          </w:p>
+        </w:tc>
+        <w:tc>
+          <w:tcPr>
+            <w:tcW w:type="dxa" w:w="851"/>
+            <w:shd w:fill="FFFFFF"/>
+            <w:tcMar>
+              <w:top w:w="100" w:type="dxa"/>
+              <w:bottom w:w="100" w:type="dxa"/>
+              <w:left w:w="150" w:type="dxa"/>
+              <w:right w:w="150" w:type="dxa"/>
+            </w:tcMar>
+          </w:tcPr>
+          <w:p>
+            <w:pPr>
+              <w:spacing w:after="0" w:before="0"/>
+              <w:jc w:val="center"/>
+            </w:pPr>
+            <w:r>
+              <w:rPr>
+                <w:rFonts w:ascii="Arial" w:hAnsi="Arial"/>
+                <w:b w:val="0"/>
+                <w:i w:val="0"/>
+                <w:sz w:val="18"/>
+              </w:rPr>
+              <w:t>0.0000</w:t>
+            </w:r>
+          </w:p>
+        </w:tc>
+        <w:tc>
+          <w:tcPr>
+            <w:tcW w:type="dxa" w:w="851"/>
+            <w:shd w:fill="FFFFFF"/>
+            <w:tcMar>
+              <w:top w:w="100" w:type="dxa"/>
+              <w:bottom w:w="100" w:type="dxa"/>
+              <w:left w:w="150" w:type="dxa"/>
+              <w:right w:w="150" w:type="dxa"/>
+            </w:tcMar>
+          </w:tcPr>
+          <w:p>
+            <w:pPr>
+              <w:spacing w:after="0" w:before="0"/>
+              <w:jc w:val="center"/>
+            </w:pPr>
+            <w:r>
+              <w:rPr>
+                <w:rFonts w:ascii="Arial" w:hAnsi="Arial"/>
+                <w:b w:val="0"/>
+                <w:i w:val="0"/>
+                <w:sz w:val="18"/>
+              </w:rPr>
+              <w:t>0.5322</w:t>
+            </w:r>
+          </w:p>
+        </w:tc>
+        <w:tc>
+          <w:tcPr>
+            <w:tcW w:type="dxa" w:w="851"/>
+            <w:shd w:fill="FFFFFF"/>
+            <w:tcMar>
+              <w:top w:w="100" w:type="dxa"/>
+              <w:bottom w:w="100" w:type="dxa"/>
+              <w:left w:w="150" w:type="dxa"/>
+              <w:right w:w="150" w:type="dxa"/>
+            </w:tcMar>
+          </w:tcPr>
+          <w:p>
+            <w:pPr>
+              <w:spacing w:after="0" w:before="0"/>
+              <w:jc w:val="center"/>
+            </w:pPr>
+            <w:r>
+              <w:rPr>
+                <w:rFonts w:ascii="Arial" w:hAnsi="Arial"/>
+                <w:b w:val="0"/>
+                <w:i w:val="0"/>
+                <w:sz w:val="18"/>
+              </w:rPr>
+              <w:t>26.73</w:t>
+            </w:r>
+          </w:p>
+        </w:tc>
+        <w:tc>
+          <w:tcPr>
+            <w:tcW w:type="dxa" w:w="851"/>
+            <w:shd w:fill="FFFFFF"/>
+            <w:tcMar>
+              <w:top w:w="100" w:type="dxa"/>
+              <w:bottom w:w="100" w:type="dxa"/>
+              <w:left w:w="150" w:type="dxa"/>
+              <w:right w:w="150" w:type="dxa"/>
+            </w:tcMar>
+          </w:tcPr>
+          <w:p>
+            <w:pPr>
+              <w:spacing w:after="0" w:before="0"/>
+              <w:jc w:val="center"/>
+            </w:pPr>
+            <w:r>
+              <w:rPr>
+                <w:rFonts w:ascii="Arial" w:hAnsi="Arial"/>
+                <w:b w:val="0"/>
+                <w:i w:val="0"/>
+                <w:sz w:val="18"/>
+              </w:rPr>
+              <w:t>0.0000</w:t>
+            </w:r>
+          </w:p>
+        </w:tc>
+        <w:tc>
+          <w:tcPr>
+            <w:tcW w:type="dxa" w:w="851"/>
+            <w:shd w:fill="FFFFFF"/>
+            <w:tcMar>
+              <w:top w:w="100" w:type="dxa"/>
+              <w:bottom w:w="100" w:type="dxa"/>
+              <w:left w:w="150" w:type="dxa"/>
+              <w:right w:w="150" w:type="dxa"/>
+            </w:tcMar>
+          </w:tcPr>
+          <w:p>
+            <w:pPr>
+              <w:spacing w:after="0" w:before="0"/>
+              <w:jc w:val="center"/>
+            </w:pPr>
+            <w:r>
+              <w:rPr>
+                <w:rFonts w:ascii="Arial" w:hAnsi="Arial"/>
+                <w:b w:val="0"/>
+                <w:i w:val="0"/>
+                <w:sz w:val="18"/>
+              </w:rPr>
+              <w:t>True</w:t>
+            </w:r>
+          </w:p>
+        </w:tc>
+        <w:tc>
+          <w:tcPr>
+            <w:tcW w:type="dxa" w:w="851"/>
+            <w:shd w:fill="FFFFFF"/>
+            <w:tcMar>
+              <w:top w:w="100" w:type="dxa"/>
+              <w:bottom w:w="100" w:type="dxa"/>
+              <w:left w:w="150" w:type="dxa"/>
+              <w:right w:w="150" w:type="dxa"/>
+            </w:tcMar>
+          </w:tcPr>
+          <w:p>
+            <w:pPr>
+              <w:spacing w:after="0" w:before="0"/>
+              <w:jc w:val="center"/>
+            </w:pPr>
+            <w:r>
+              <w:rPr>
+                <w:rFonts w:ascii="Arial" w:hAnsi="Arial"/>
+                <w:b w:val="0"/>
+                <w:i w:val="0"/>
+                <w:sz w:val="18"/>
+              </w:rPr>
+              <w:t>log</w:t>
+            </w:r>
+          </w:p>
+        </w:tc>
+        <w:tc>
+          <w:tcPr>
+            <w:tcW w:type="dxa" w:w="851"/>
+            <w:shd w:fill="FFFFFF"/>
+            <w:tcMar>
+              <w:top w:w="100" w:type="dxa"/>
+              <w:bottom w:w="100" w:type="dxa"/>
+              <w:left w:w="150" w:type="dxa"/>
+              <w:right w:w="150" w:type="dxa"/>
+            </w:tcMar>
+          </w:tcPr>
+          <w:p>
+            <w:pPr>
+              <w:spacing w:after="0" w:before="0"/>
+              <w:jc w:val="center"/>
+            </w:pPr>
+            <w:r>
+              <w:rPr>
+                <w:rFonts w:ascii="Arial" w:hAnsi="Arial"/>
+                <w:b w:val="0"/>
+                <w:i w:val="0"/>
+                <w:sz w:val="18"/>
+              </w:rPr>
+              <w:t>k&lt;0.5: 290, 0.5&lt;=k&lt;=0.7: 139, k&gt;0.7: 59</w:t>
+            </w:r>
+          </w:p>
+        </w:tc>
+      </w:tr>
+      <w:tr>
+        <w:tc>
+          <w:tcPr>
+            <w:tcW w:type="dxa" w:w="851"/>
+            <w:shd w:fill="F9F9F9"/>
+            <w:tcMar>
+              <w:top w:w="100" w:type="dxa"/>
+              <w:bottom w:w="100" w:type="dxa"/>
+              <w:left w:w="150" w:type="dxa"/>
+              <w:right w:w="150" w:type="dxa"/>
+            </w:tcMar>
+          </w:tcPr>
+          <w:p>
+            <w:pPr>
+              <w:spacing w:after="0" w:before="0"/>
+              <w:jc w:val="center"/>
+            </w:pPr>
+            <w:r>
+              <w:rPr>
+                <w:rFonts w:ascii="Arial" w:hAnsi="Arial"/>
+                <w:b w:val="0"/>
+                <w:i w:val="0"/>
+                <w:sz w:val="18"/>
+              </w:rPr>
+              <w:t>Binomial Negativa (ICAR + No Estructurado)</w:t>
+            </w:r>
+          </w:p>
+        </w:tc>
+        <w:tc>
+          <w:tcPr>
+            <w:tcW w:type="dxa" w:w="851"/>
+            <w:shd w:fill="F9F9F9"/>
+            <w:tcMar>
+              <w:top w:w="100" w:type="dxa"/>
+              <w:bottom w:w="100" w:type="dxa"/>
+              <w:left w:w="150" w:type="dxa"/>
+              <w:right w:w="150" w:type="dxa"/>
+            </w:tcMar>
+          </w:tcPr>
+          <w:p>
+            <w:pPr>
+              <w:spacing w:after="0" w:before="0"/>
+              <w:jc w:val="center"/>
+            </w:pPr>
+            <w:r>
+              <w:rPr>
+                <w:rFonts w:ascii="Arial" w:hAnsi="Arial"/>
+                <w:b w:val="0"/>
+                <w:i w:val="0"/>
+                <w:sz w:val="18"/>
+              </w:rPr>
+              <w:t>1</w:t>
+            </w:r>
+          </w:p>
+        </w:tc>
+        <w:tc>
+          <w:tcPr>
+            <w:tcW w:type="dxa" w:w="851"/>
+            <w:shd w:fill="F9F9F9"/>
+            <w:tcMar>
+              <w:top w:w="100" w:type="dxa"/>
+              <w:bottom w:w="100" w:type="dxa"/>
+              <w:left w:w="150" w:type="dxa"/>
+              <w:right w:w="150" w:type="dxa"/>
+            </w:tcMar>
+          </w:tcPr>
+          <w:p>
+            <w:pPr>
+              <w:spacing w:after="0" w:before="0"/>
+              <w:jc w:val="center"/>
+            </w:pPr>
+            <w:r>
+              <w:rPr>
+                <w:rFonts w:ascii="Arial" w:hAnsi="Arial"/>
+                <w:b w:val="0"/>
+                <w:i w:val="0"/>
+                <w:sz w:val="18"/>
+              </w:rPr>
+              <w:t>-1321.3694</w:t>
+            </w:r>
+          </w:p>
+        </w:tc>
+        <w:tc>
+          <w:tcPr>
+            <w:tcW w:type="dxa" w:w="851"/>
+            <w:shd w:fill="F9F9F9"/>
+            <w:tcMar>
+              <w:top w:w="100" w:type="dxa"/>
+              <w:bottom w:w="100" w:type="dxa"/>
+              <w:left w:w="150" w:type="dxa"/>
+              <w:right w:w="150" w:type="dxa"/>
+            </w:tcMar>
+          </w:tcPr>
+          <w:p>
+            <w:pPr>
+              <w:spacing w:after="0" w:before="0"/>
+              <w:jc w:val="center"/>
+            </w:pPr>
+            <w:r>
+              <w:rPr>
+                <w:rFonts w:ascii="Arial" w:hAnsi="Arial"/>
+                <w:b w:val="0"/>
+                <w:i w:val="0"/>
+                <w:sz w:val="18"/>
+              </w:rPr>
+              <w:t>168.64</w:t>
+            </w:r>
+          </w:p>
+        </w:tc>
+        <w:tc>
+          <w:tcPr>
+            <w:tcW w:type="dxa" w:w="851"/>
+            <w:shd w:fill="F9F9F9"/>
+            <w:tcMar>
+              <w:top w:w="100" w:type="dxa"/>
+              <w:bottom w:w="100" w:type="dxa"/>
+              <w:left w:w="150" w:type="dxa"/>
+              <w:right w:w="150" w:type="dxa"/>
+            </w:tcMar>
+          </w:tcPr>
+          <w:p>
+            <w:pPr>
+              <w:spacing w:after="0" w:before="0"/>
+              <w:jc w:val="center"/>
+            </w:pPr>
+            <w:r>
+              <w:rPr>
+                <w:rFonts w:ascii="Arial" w:hAnsi="Arial"/>
+                <w:b w:val="0"/>
+                <w:i w:val="0"/>
+                <w:sz w:val="18"/>
+              </w:rPr>
+              <w:t>0.0970</w:t>
+            </w:r>
+          </w:p>
+        </w:tc>
+        <w:tc>
+          <w:tcPr>
+            <w:tcW w:type="dxa" w:w="851"/>
+            <w:shd w:fill="F9F9F9"/>
+            <w:tcMar>
+              <w:top w:w="100" w:type="dxa"/>
+              <w:bottom w:w="100" w:type="dxa"/>
+              <w:left w:w="150" w:type="dxa"/>
+              <w:right w:w="150" w:type="dxa"/>
+            </w:tcMar>
+          </w:tcPr>
+          <w:p>
+            <w:pPr>
+              <w:spacing w:after="0" w:before="0"/>
+              <w:jc w:val="center"/>
+            </w:pPr>
+            <w:r>
+              <w:rPr>
+                <w:rFonts w:ascii="Arial" w:hAnsi="Arial"/>
+                <w:b w:val="0"/>
+                <w:i w:val="0"/>
+                <w:sz w:val="18"/>
+              </w:rPr>
+              <w:t>0.3853</w:t>
+            </w:r>
+          </w:p>
+        </w:tc>
+        <w:tc>
+          <w:tcPr>
+            <w:tcW w:type="dxa" w:w="851"/>
+            <w:shd w:fill="F9F9F9"/>
+            <w:tcMar>
+              <w:top w:w="100" w:type="dxa"/>
+              <w:bottom w:w="100" w:type="dxa"/>
+              <w:left w:w="150" w:type="dxa"/>
+              <w:right w:w="150" w:type="dxa"/>
+            </w:tcMar>
+          </w:tcPr>
+          <w:p>
+            <w:pPr>
+              <w:spacing w:after="0" w:before="0"/>
+              <w:jc w:val="center"/>
+            </w:pPr>
+            <w:r>
+              <w:rPr>
+                <w:rFonts w:ascii="Arial" w:hAnsi="Arial"/>
+                <w:b w:val="0"/>
+                <w:i w:val="0"/>
+                <w:sz w:val="18"/>
+              </w:rPr>
+              <w:t>26.82</w:t>
+            </w:r>
+          </w:p>
+        </w:tc>
+        <w:tc>
+          <w:tcPr>
+            <w:tcW w:type="dxa" w:w="851"/>
+            <w:shd w:fill="F9F9F9"/>
+            <w:tcMar>
+              <w:top w:w="100" w:type="dxa"/>
+              <w:bottom w:w="100" w:type="dxa"/>
+              <w:left w:w="150" w:type="dxa"/>
+              <w:right w:w="150" w:type="dxa"/>
+            </w:tcMar>
+          </w:tcPr>
+          <w:p>
+            <w:pPr>
+              <w:spacing w:after="0" w:before="0"/>
+              <w:jc w:val="center"/>
+            </w:pPr>
+            <w:r>
+              <w:rPr>
+                <w:rFonts w:ascii="Arial" w:hAnsi="Arial"/>
+                <w:b w:val="0"/>
+                <w:i w:val="0"/>
+                <w:sz w:val="18"/>
+              </w:rPr>
+              <w:t>1.18</w:t>
+            </w:r>
+          </w:p>
+        </w:tc>
+        <w:tc>
+          <w:tcPr>
+            <w:tcW w:type="dxa" w:w="851"/>
+            <w:shd w:fill="F9F9F9"/>
+            <w:tcMar>
+              <w:top w:w="100" w:type="dxa"/>
+              <w:bottom w:w="100" w:type="dxa"/>
+              <w:left w:w="150" w:type="dxa"/>
+              <w:right w:w="150" w:type="dxa"/>
+            </w:tcMar>
+          </w:tcPr>
+          <w:p>
+            <w:pPr>
+              <w:spacing w:after="0" w:before="0"/>
+              <w:jc w:val="center"/>
+            </w:pPr>
+            <w:r>
+              <w:rPr>
+                <w:rFonts w:ascii="Arial" w:hAnsi="Arial"/>
+                <w:b w:val="0"/>
+                <w:i w:val="0"/>
+                <w:sz w:val="18"/>
+              </w:rPr>
+              <w:t>True</w:t>
+            </w:r>
+          </w:p>
+        </w:tc>
+        <w:tc>
+          <w:tcPr>
+            <w:tcW w:type="dxa" w:w="851"/>
+            <w:shd w:fill="F9F9F9"/>
+            <w:tcMar>
+              <w:top w:w="100" w:type="dxa"/>
+              <w:bottom w:w="100" w:type="dxa"/>
+              <w:left w:w="150" w:type="dxa"/>
+              <w:right w:w="150" w:type="dxa"/>
+            </w:tcMar>
+          </w:tcPr>
+          <w:p>
+            <w:pPr>
+              <w:spacing w:after="0" w:before="0"/>
+              <w:jc w:val="center"/>
+            </w:pPr>
+            <w:r>
+              <w:rPr>
+                <w:rFonts w:ascii="Arial" w:hAnsi="Arial"/>
+                <w:b w:val="0"/>
+                <w:i w:val="0"/>
+                <w:sz w:val="18"/>
+              </w:rPr>
+              <w:t>log</w:t>
+            </w:r>
+          </w:p>
+        </w:tc>
+        <w:tc>
+          <w:tcPr>
+            <w:tcW w:type="dxa" w:w="851"/>
+            <w:shd w:fill="F9F9F9"/>
+            <w:tcMar>
+              <w:top w:w="100" w:type="dxa"/>
+              <w:bottom w:w="100" w:type="dxa"/>
+              <w:left w:w="150" w:type="dxa"/>
+              <w:right w:w="150" w:type="dxa"/>
+            </w:tcMar>
+          </w:tcPr>
+          <w:p>
+            <w:pPr>
+              <w:spacing w:after="0" w:before="0"/>
+              <w:jc w:val="center"/>
+            </w:pPr>
+            <w:r>
+              <w:rPr>
+                <w:rFonts w:ascii="Arial" w:hAnsi="Arial"/>
+                <w:b w:val="0"/>
+                <w:i w:val="0"/>
+                <w:sz w:val="18"/>
+              </w:rPr>
+              <w:t>k&lt;0.5: 291, 0.5&lt;=k&lt;=0.7: 151, k&gt;0.7: 46</w:t>
+            </w:r>
+          </w:p>
+        </w:tc>
+      </w:tr>
+      <w:tr>
+        <w:tc>
+          <w:tcPr>
+            <w:tcW w:type="dxa" w:w="851"/>
+            <w:shd w:fill="FFFFFF"/>
+            <w:tcMar>
+              <w:top w:w="100" w:type="dxa"/>
+              <w:bottom w:w="100" w:type="dxa"/>
+              <w:left w:w="150" w:type="dxa"/>
+              <w:right w:w="150" w:type="dxa"/>
+            </w:tcMar>
+          </w:tcPr>
+          <w:p>
+            <w:pPr>
+              <w:spacing w:after="0" w:before="0"/>
+              <w:jc w:val="center"/>
+            </w:pPr>
+            <w:r>
+              <w:rPr>
+                <w:rFonts w:ascii="Arial" w:hAnsi="Arial"/>
+                <w:b w:val="0"/>
+                <w:i w:val="0"/>
+                <w:sz w:val="18"/>
+              </w:rPr>
+              <w:t>Binomial Negativa (ICAR)</w:t>
+            </w:r>
+          </w:p>
+        </w:tc>
+        <w:tc>
+          <w:tcPr>
+            <w:tcW w:type="dxa" w:w="851"/>
+            <w:shd w:fill="FFFFFF"/>
+            <w:tcMar>
+              <w:top w:w="100" w:type="dxa"/>
+              <w:bottom w:w="100" w:type="dxa"/>
+              <w:left w:w="150" w:type="dxa"/>
+              <w:right w:w="150" w:type="dxa"/>
+            </w:tcMar>
+          </w:tcPr>
+          <w:p>
+            <w:pPr>
+              <w:spacing w:after="0" w:before="0"/>
+              <w:jc w:val="center"/>
+            </w:pPr>
+            <w:r>
+              <w:rPr>
+                <w:rFonts w:ascii="Arial" w:hAnsi="Arial"/>
+                <w:b w:val="0"/>
+                <w:i w:val="0"/>
+                <w:sz w:val="18"/>
+              </w:rPr>
+              <w:t>2</w:t>
+            </w:r>
+          </w:p>
+        </w:tc>
+        <w:tc>
+          <w:tcPr>
+            <w:tcW w:type="dxa" w:w="851"/>
+            <w:shd w:fill="FFFFFF"/>
+            <w:tcMar>
+              <w:top w:w="100" w:type="dxa"/>
+              <w:bottom w:w="100" w:type="dxa"/>
+              <w:left w:w="150" w:type="dxa"/>
+              <w:right w:w="150" w:type="dxa"/>
+            </w:tcMar>
+          </w:tcPr>
+          <w:p>
+            <w:pPr>
+              <w:spacing w:after="0" w:before="0"/>
+              <w:jc w:val="center"/>
+            </w:pPr>
+            <w:r>
+              <w:rPr>
+                <w:rFonts w:ascii="Arial" w:hAnsi="Arial"/>
+                <w:b w:val="0"/>
+                <w:i w:val="0"/>
+                <w:sz w:val="18"/>
+              </w:rPr>
+              <w:t>-1323.9855</w:t>
+            </w:r>
+          </w:p>
+        </w:tc>
+        <w:tc>
+          <w:tcPr>
+            <w:tcW w:type="dxa" w:w="851"/>
+            <w:shd w:fill="FFFFFF"/>
+            <w:tcMar>
+              <w:top w:w="100" w:type="dxa"/>
+              <w:bottom w:w="100" w:type="dxa"/>
+              <w:left w:w="150" w:type="dxa"/>
+              <w:right w:w="150" w:type="dxa"/>
+            </w:tcMar>
+          </w:tcPr>
+          <w:p>
+            <w:pPr>
+              <w:spacing w:after="0" w:before="0"/>
+              <w:jc w:val="center"/>
+            </w:pPr>
+            <w:r>
+              <w:rPr>
+                <w:rFonts w:ascii="Arial" w:hAnsi="Arial"/>
+                <w:b w:val="0"/>
+                <w:i w:val="0"/>
+                <w:sz w:val="18"/>
+              </w:rPr>
+              <w:t>164.52</w:t>
+            </w:r>
+          </w:p>
+        </w:tc>
+        <w:tc>
+          <w:tcPr>
+            <w:tcW w:type="dxa" w:w="851"/>
+            <w:shd w:fill="FFFFFF"/>
+            <w:tcMar>
+              <w:top w:w="100" w:type="dxa"/>
+              <w:bottom w:w="100" w:type="dxa"/>
+              <w:left w:w="150" w:type="dxa"/>
+              <w:right w:w="150" w:type="dxa"/>
+            </w:tcMar>
+          </w:tcPr>
+          <w:p>
+            <w:pPr>
+              <w:spacing w:after="0" w:before="0"/>
+              <w:jc w:val="center"/>
+            </w:pPr>
+            <w:r>
+              <w:rPr>
+                <w:rFonts w:ascii="Arial" w:hAnsi="Arial"/>
+                <w:b w:val="0"/>
+                <w:i w:val="0"/>
+                <w:sz w:val="18"/>
+              </w:rPr>
+              <w:t>2.71</w:t>
+            </w:r>
+          </w:p>
+        </w:tc>
+        <w:tc>
+          <w:tcPr>
+            <w:tcW w:type="dxa" w:w="851"/>
+            <w:shd w:fill="FFFFFF"/>
+            <w:tcMar>
+              <w:top w:w="100" w:type="dxa"/>
+              <w:bottom w:w="100" w:type="dxa"/>
+              <w:left w:w="150" w:type="dxa"/>
+              <w:right w:w="150" w:type="dxa"/>
+            </w:tcMar>
+          </w:tcPr>
+          <w:p>
+            <w:pPr>
+              <w:spacing w:after="0" w:before="0"/>
+              <w:jc w:val="center"/>
+            </w:pPr>
+            <w:r>
+              <w:rPr>
+                <w:rFonts w:ascii="Arial" w:hAnsi="Arial"/>
+                <w:b w:val="0"/>
+                <w:i w:val="0"/>
+                <w:sz w:val="18"/>
+              </w:rPr>
+              <w:t>0.0000</w:t>
+            </w:r>
+          </w:p>
+        </w:tc>
+        <w:tc>
+          <w:tcPr>
+            <w:tcW w:type="dxa" w:w="851"/>
+            <w:shd w:fill="FFFFFF"/>
+            <w:tcMar>
+              <w:top w:w="100" w:type="dxa"/>
+              <w:bottom w:w="100" w:type="dxa"/>
+              <w:left w:w="150" w:type="dxa"/>
+              <w:right w:w="150" w:type="dxa"/>
+            </w:tcMar>
+          </w:tcPr>
+          <w:p>
+            <w:pPr>
+              <w:spacing w:after="0" w:before="0"/>
+              <w:jc w:val="center"/>
+            </w:pPr>
+            <w:r>
+              <w:rPr>
+                <w:rFonts w:ascii="Arial" w:hAnsi="Arial"/>
+                <w:b w:val="0"/>
+                <w:i w:val="0"/>
+                <w:sz w:val="18"/>
+              </w:rPr>
+              <w:t>27.06</w:t>
+            </w:r>
+          </w:p>
+        </w:tc>
+        <w:tc>
+          <w:tcPr>
+            <w:tcW w:type="dxa" w:w="851"/>
+            <w:shd w:fill="FFFFFF"/>
+            <w:tcMar>
+              <w:top w:w="100" w:type="dxa"/>
+              <w:bottom w:w="100" w:type="dxa"/>
+              <w:left w:w="150" w:type="dxa"/>
+              <w:right w:w="150" w:type="dxa"/>
+            </w:tcMar>
+          </w:tcPr>
+          <w:p>
+            <w:pPr>
+              <w:spacing w:after="0" w:before="0"/>
+              <w:jc w:val="center"/>
+            </w:pPr>
+            <w:r>
+              <w:rPr>
+                <w:rFonts w:ascii="Arial" w:hAnsi="Arial"/>
+                <w:b w:val="0"/>
+                <w:i w:val="0"/>
+                <w:sz w:val="18"/>
+              </w:rPr>
+              <w:t>2.38</w:t>
+            </w:r>
+          </w:p>
+        </w:tc>
+        <w:tc>
+          <w:tcPr>
+            <w:tcW w:type="dxa" w:w="851"/>
+            <w:shd w:fill="FFFFFF"/>
+            <w:tcMar>
+              <w:top w:w="100" w:type="dxa"/>
+              <w:bottom w:w="100" w:type="dxa"/>
+              <w:left w:w="150" w:type="dxa"/>
+              <w:right w:w="150" w:type="dxa"/>
+            </w:tcMar>
+          </w:tcPr>
+          <w:p>
+            <w:pPr>
+              <w:spacing w:after="0" w:before="0"/>
+              <w:jc w:val="center"/>
+            </w:pPr>
+            <w:r>
+              <w:rPr>
+                <w:rFonts w:ascii="Arial" w:hAnsi="Arial"/>
+                <w:b w:val="0"/>
+                <w:i w:val="0"/>
+                <w:sz w:val="18"/>
+              </w:rPr>
+              <w:t>True</w:t>
+            </w:r>
+          </w:p>
+        </w:tc>
+        <w:tc>
+          <w:tcPr>
+            <w:tcW w:type="dxa" w:w="851"/>
+            <w:shd w:fill="FFFFFF"/>
+            <w:tcMar>
+              <w:top w:w="100" w:type="dxa"/>
+              <w:bottom w:w="100" w:type="dxa"/>
+              <w:left w:w="150" w:type="dxa"/>
+              <w:right w:w="150" w:type="dxa"/>
+            </w:tcMar>
+          </w:tcPr>
+          <w:p>
+            <w:pPr>
+              <w:spacing w:after="0" w:before="0"/>
+              <w:jc w:val="center"/>
+            </w:pPr>
+            <w:r>
+              <w:rPr>
+                <w:rFonts w:ascii="Arial" w:hAnsi="Arial"/>
+                <w:b w:val="0"/>
+                <w:i w:val="0"/>
+                <w:sz w:val="18"/>
+              </w:rPr>
+              <w:t>log</w:t>
+            </w:r>
+          </w:p>
+        </w:tc>
+        <w:tc>
+          <w:tcPr>
+            <w:tcW w:type="dxa" w:w="851"/>
+            <w:shd w:fill="FFFFFF"/>
+            <w:tcMar>
+              <w:top w:w="100" w:type="dxa"/>
+              <w:bottom w:w="100" w:type="dxa"/>
+              <w:left w:w="150" w:type="dxa"/>
+              <w:right w:w="150" w:type="dxa"/>
+            </w:tcMar>
+          </w:tcPr>
+          <w:p>
+            <w:pPr>
+              <w:spacing w:after="0" w:before="0"/>
+              <w:jc w:val="center"/>
+            </w:pPr>
+            <w:r>
+              <w:rPr>
+                <w:rFonts w:ascii="Arial" w:hAnsi="Arial"/>
+                <w:b w:val="0"/>
+                <w:i w:val="0"/>
+                <w:sz w:val="18"/>
+              </w:rPr>
+              <w:t>k&lt;0.5: 290, 0.5&lt;=k&lt;=0.7: 154, k&gt;0.7: 44</w:t>
+            </w:r>
+          </w:p>
+        </w:tc>
+      </w:tr>
+      <w:tr>
+        <w:tc>
+          <w:tcPr>
+            <w:tcW w:type="dxa" w:w="851"/>
+            <w:shd w:fill="F9F9F9"/>
+            <w:tcMar>
+              <w:top w:w="100" w:type="dxa"/>
+              <w:bottom w:w="100" w:type="dxa"/>
+              <w:left w:w="150" w:type="dxa"/>
+              <w:right w:w="150" w:type="dxa"/>
+            </w:tcMar>
+          </w:tcPr>
+          <w:p>
+            <w:pPr>
+              <w:spacing w:after="0" w:before="0"/>
+              <w:jc w:val="center"/>
+            </w:pPr>
+            <w:r>
+              <w:rPr>
+                <w:rFonts w:ascii="Arial" w:hAnsi="Arial"/>
+                <w:b w:val="0"/>
+                <w:i w:val="0"/>
+                <w:sz w:val="18"/>
+              </w:rPr>
+              <w:t>Poisson Jerárquico</w:t>
+            </w:r>
+          </w:p>
+        </w:tc>
+        <w:tc>
+          <w:tcPr>
+            <w:tcW w:type="dxa" w:w="851"/>
+            <w:shd w:fill="F9F9F9"/>
+            <w:tcMar>
+              <w:top w:w="100" w:type="dxa"/>
+              <w:bottom w:w="100" w:type="dxa"/>
+              <w:left w:w="150" w:type="dxa"/>
+              <w:right w:w="150" w:type="dxa"/>
+            </w:tcMar>
+          </w:tcPr>
+          <w:p>
+            <w:pPr>
+              <w:spacing w:after="0" w:before="0"/>
+              <w:jc w:val="center"/>
+            </w:pPr>
+            <w:r>
+              <w:rPr>
+                <w:rFonts w:ascii="Arial" w:hAnsi="Arial"/>
+                <w:b w:val="0"/>
+                <w:i w:val="0"/>
+                <w:sz w:val="18"/>
+              </w:rPr>
+              <w:t>3</w:t>
+            </w:r>
+          </w:p>
+        </w:tc>
+        <w:tc>
+          <w:tcPr>
+            <w:tcW w:type="dxa" w:w="851"/>
+            <w:shd w:fill="F9F9F9"/>
+            <w:tcMar>
+              <w:top w:w="100" w:type="dxa"/>
+              <w:bottom w:w="100" w:type="dxa"/>
+              <w:left w:w="150" w:type="dxa"/>
+              <w:right w:w="150" w:type="dxa"/>
+            </w:tcMar>
+          </w:tcPr>
+          <w:p>
+            <w:pPr>
+              <w:spacing w:after="0" w:before="0"/>
+              <w:jc w:val="center"/>
+            </w:pPr>
+            <w:r>
+              <w:rPr>
+                <w:rFonts w:ascii="Arial" w:hAnsi="Arial"/>
+                <w:b w:val="0"/>
+                <w:i w:val="0"/>
+                <w:sz w:val="18"/>
+              </w:rPr>
+              <w:t>-1434.3509</w:t>
+            </w:r>
+          </w:p>
+        </w:tc>
+        <w:tc>
+          <w:tcPr>
+            <w:tcW w:type="dxa" w:w="851"/>
+            <w:shd w:fill="F9F9F9"/>
+            <w:tcMar>
+              <w:top w:w="100" w:type="dxa"/>
+              <w:bottom w:w="100" w:type="dxa"/>
+              <w:left w:w="150" w:type="dxa"/>
+              <w:right w:w="150" w:type="dxa"/>
+            </w:tcMar>
+          </w:tcPr>
+          <w:p>
+            <w:pPr>
+              <w:spacing w:after="0" w:before="0"/>
+              <w:jc w:val="center"/>
+            </w:pPr>
+            <w:r>
+              <w:rPr>
+                <w:rFonts w:ascii="Arial" w:hAnsi="Arial"/>
+                <w:b w:val="0"/>
+                <w:i w:val="0"/>
+                <w:sz w:val="18"/>
+              </w:rPr>
+              <w:t>360.22</w:t>
+            </w:r>
+          </w:p>
+        </w:tc>
+        <w:tc>
+          <w:tcPr>
+            <w:tcW w:type="dxa" w:w="851"/>
+            <w:shd w:fill="F9F9F9"/>
+            <w:tcMar>
+              <w:top w:w="100" w:type="dxa"/>
+              <w:bottom w:w="100" w:type="dxa"/>
+              <w:left w:w="150" w:type="dxa"/>
+              <w:right w:w="150" w:type="dxa"/>
+            </w:tcMar>
+          </w:tcPr>
+          <w:p>
+            <w:pPr>
+              <w:spacing w:after="0" w:before="0"/>
+              <w:jc w:val="center"/>
+            </w:pPr>
+            <w:r>
+              <w:rPr>
+                <w:rFonts w:ascii="Arial" w:hAnsi="Arial"/>
+                <w:b w:val="0"/>
+                <w:i w:val="0"/>
+                <w:sz w:val="18"/>
+              </w:rPr>
+              <w:t>113.08</w:t>
+            </w:r>
+          </w:p>
+        </w:tc>
+        <w:tc>
+          <w:tcPr>
+            <w:tcW w:type="dxa" w:w="851"/>
+            <w:shd w:fill="F9F9F9"/>
+            <w:tcMar>
+              <w:top w:w="100" w:type="dxa"/>
+              <w:bottom w:w="100" w:type="dxa"/>
+              <w:left w:w="150" w:type="dxa"/>
+              <w:right w:w="150" w:type="dxa"/>
+            </w:tcMar>
+          </w:tcPr>
+          <w:p>
+            <w:pPr>
+              <w:spacing w:after="0" w:before="0"/>
+              <w:jc w:val="center"/>
+            </w:pPr>
+            <w:r>
+              <w:rPr>
+                <w:rFonts w:ascii="Arial" w:hAnsi="Arial"/>
+                <w:b w:val="0"/>
+                <w:i w:val="0"/>
+                <w:sz w:val="18"/>
+              </w:rPr>
+              <w:t>0.0825</w:t>
+            </w:r>
+          </w:p>
+        </w:tc>
+        <w:tc>
+          <w:tcPr>
+            <w:tcW w:type="dxa" w:w="851"/>
+            <w:shd w:fill="F9F9F9"/>
+            <w:tcMar>
+              <w:top w:w="100" w:type="dxa"/>
+              <w:bottom w:w="100" w:type="dxa"/>
+              <w:left w:w="150" w:type="dxa"/>
+              <w:right w:w="150" w:type="dxa"/>
+            </w:tcMar>
+          </w:tcPr>
+          <w:p>
+            <w:pPr>
+              <w:spacing w:after="0" w:before="0"/>
+              <w:jc w:val="center"/>
+            </w:pPr>
+            <w:r>
+              <w:rPr>
+                <w:rFonts w:ascii="Arial" w:hAnsi="Arial"/>
+                <w:b w:val="0"/>
+                <w:i w:val="0"/>
+                <w:sz w:val="18"/>
+              </w:rPr>
+              <w:t>43.60</w:t>
+            </w:r>
+          </w:p>
+        </w:tc>
+        <w:tc>
+          <w:tcPr>
+            <w:tcW w:type="dxa" w:w="851"/>
+            <w:shd w:fill="F9F9F9"/>
+            <w:tcMar>
+              <w:top w:w="100" w:type="dxa"/>
+              <w:bottom w:w="100" w:type="dxa"/>
+              <w:left w:w="150" w:type="dxa"/>
+              <w:right w:w="150" w:type="dxa"/>
+            </w:tcMar>
+          </w:tcPr>
+          <w:p>
+            <w:pPr>
+              <w:spacing w:after="0" w:before="0"/>
+              <w:jc w:val="center"/>
+            </w:pPr>
+            <w:r>
+              <w:rPr>
+                <w:rFonts w:ascii="Arial" w:hAnsi="Arial"/>
+                <w:b w:val="0"/>
+                <w:i w:val="0"/>
+                <w:sz w:val="18"/>
+              </w:rPr>
+              <w:t>24.43</w:t>
+            </w:r>
+          </w:p>
+        </w:tc>
+        <w:tc>
+          <w:tcPr>
+            <w:tcW w:type="dxa" w:w="851"/>
+            <w:shd w:fill="F9F9F9"/>
+            <w:tcMar>
+              <w:top w:w="100" w:type="dxa"/>
+              <w:bottom w:w="100" w:type="dxa"/>
+              <w:left w:w="150" w:type="dxa"/>
+              <w:right w:w="150" w:type="dxa"/>
+            </w:tcMar>
+          </w:tcPr>
+          <w:p>
+            <w:pPr>
+              <w:spacing w:after="0" w:before="0"/>
+              <w:jc w:val="center"/>
+            </w:pPr>
+            <w:r>
+              <w:rPr>
+                <w:rFonts w:ascii="Arial" w:hAnsi="Arial"/>
+                <w:b w:val="0"/>
+                <w:i w:val="0"/>
+                <w:sz w:val="18"/>
+              </w:rPr>
+              <w:t>True</w:t>
+            </w:r>
+          </w:p>
+        </w:tc>
+        <w:tc>
+          <w:tcPr>
+            <w:tcW w:type="dxa" w:w="851"/>
+            <w:shd w:fill="F9F9F9"/>
+            <w:tcMar>
+              <w:top w:w="100" w:type="dxa"/>
+              <w:bottom w:w="100" w:type="dxa"/>
+              <w:left w:w="150" w:type="dxa"/>
+              <w:right w:w="150" w:type="dxa"/>
+            </w:tcMar>
+          </w:tcPr>
+          <w:p>
+            <w:pPr>
+              <w:spacing w:after="0" w:before="0"/>
+              <w:jc w:val="center"/>
+            </w:pPr>
+            <w:r>
+              <w:rPr>
+                <w:rFonts w:ascii="Arial" w:hAnsi="Arial"/>
+                <w:b w:val="0"/>
+                <w:i w:val="0"/>
+                <w:sz w:val="18"/>
+              </w:rPr>
+              <w:t>log</w:t>
+            </w:r>
+          </w:p>
+        </w:tc>
+        <w:tc>
+          <w:tcPr>
+            <w:tcW w:type="dxa" w:w="851"/>
+            <w:shd w:fill="F9F9F9"/>
+            <w:tcMar>
+              <w:top w:w="100" w:type="dxa"/>
+              <w:bottom w:w="100" w:type="dxa"/>
+              <w:left w:w="150" w:type="dxa"/>
+              <w:right w:w="150" w:type="dxa"/>
+            </w:tcMar>
+          </w:tcPr>
+          <w:p>
+            <w:pPr>
+              <w:spacing w:after="0" w:before="0"/>
+              <w:jc w:val="center"/>
+            </w:pPr>
+            <w:r>
+              <w:rPr>
+                <w:rFonts w:ascii="Arial" w:hAnsi="Arial"/>
+                <w:b w:val="0"/>
+                <w:i w:val="0"/>
+                <w:sz w:val="18"/>
+              </w:rPr>
+              <w:t>k&lt;0.5: 194, 0.5&lt;=k&lt;=0.7: 181, k&gt;0.7: 113</w:t>
             </w:r>
           </w:p>
         </w:tc>

</xml_diff>

<commit_message>
fix(methodology): dinamizar lectura de rho, corregir SE de modelos c y d, exportar diagnosticos NUTS y ajustar nota pareto-k
</commit_message>
<xml_diff>
--- a/outputs/tables/Reporte_Tesis_Flujo_Bayesiano.docx
+++ b/outputs/tables/Reporte_Tesis_Flujo_Bayesiano.docx
@@ -1359,7 +1359,7 @@
                 <w:i w:val="0"/>
                 <w:sz w:val="18"/>
               </w:rPr>
-              <w:t>4112</w:t>
+              <w:t>4200</w:t>
             </w:r>
           </w:p>
         </w:tc>
@@ -1386,7 +1386,7 @@
                 <w:i w:val="0"/>
                 <w:sz w:val="18"/>
               </w:rPr>
-              <w:t>88.74%</w:t>
+              <w:t>89.06%</w:t>
             </w:r>
           </w:p>
         </w:tc>
@@ -1469,7 +1469,7 @@
                 <w:i w:val="0"/>
                 <w:sz w:val="18"/>
               </w:rPr>
-              <w:t>268</w:t>
+              <w:t>350</w:t>
             </w:r>
           </w:p>
         </w:tc>
@@ -1496,7 +1496,7 @@
                 <w:i w:val="0"/>
                 <w:sz w:val="18"/>
               </w:rPr>
-              <w:t>5.78%</w:t>
+              <w:t>7.42%</w:t>
             </w:r>
           </w:p>
         </w:tc>
@@ -1552,7 +1552,7 @@
                 <w:i w:val="0"/>
                 <w:sz w:val="18"/>
               </w:rPr>
-              <w:t>OTROS</w:t>
+              <w:t>OTRAS</w:t>
             </w:r>
           </w:p>
         </w:tc>
@@ -1579,7 +1579,7 @@
                 <w:i w:val="0"/>
                 <w:sz w:val="18"/>
               </w:rPr>
-              <w:t>193</w:t>
+              <w:t>166</w:t>
             </w:r>
           </w:p>
         </w:tc>
@@ -1606,117 +1606,7 @@
                 <w:i w:val="0"/>
                 <w:sz w:val="18"/>
               </w:rPr>
-              <w:t>4.16%</w:t>
-            </w:r>
-          </w:p>
-        </w:tc>
-      </w:tr>
-      <w:tr>
-        <w:tc>
-          <w:tcPr>
-            <w:tcW w:type="dxa" w:w="2880"/>
-            <w:shd w:fill="F9F9F9"/>
-            <w:tcMar>
-              <w:top w:w="100" w:type="dxa"/>
-              <w:bottom w:w="100" w:type="dxa"/>
-              <w:left w:w="150" w:type="dxa"/>
-              <w:right w:w="150" w:type="dxa"/>
-            </w:tcMar>
-          </w:tcPr>
-          <w:p>
-            <w:pPr>
-              <w:spacing w:after="0" w:before="0"/>
-              <w:jc w:val="center"/>
-            </w:pPr>
-            <w:r>
-              <w:rPr>
-                <w:rFonts w:ascii="Arial" w:hAnsi="Arial"/>
-                <w:b w:val="0"/>
-                <w:i w:val="0"/>
-                <w:sz w:val="18"/>
-              </w:rPr>
-              <w:t>Tipo de Arma</w:t>
-            </w:r>
-          </w:p>
-        </w:tc>
-        <w:tc>
-          <w:tcPr>
-            <w:tcW w:type="dxa" w:w="2880"/>
-            <w:shd w:fill="F9F9F9"/>
-            <w:tcMar>
-              <w:top w:w="100" w:type="dxa"/>
-              <w:bottom w:w="100" w:type="dxa"/>
-              <w:left w:w="150" w:type="dxa"/>
-              <w:right w:w="150" w:type="dxa"/>
-            </w:tcMar>
-          </w:tcPr>
-          <w:p>
-            <w:pPr>
-              <w:spacing w:after="0" w:before="0"/>
-              <w:jc w:val="center"/>
-            </w:pPr>
-            <w:r>
-              <w:rPr>
-                <w:rFonts w:ascii="Arial" w:hAnsi="Arial"/>
-                <w:b w:val="0"/>
-                <w:i w:val="0"/>
-                <w:sz w:val="18"/>
-              </w:rPr>
-              <w:t>OBJETO CONTUNDENTE</w:t>
-            </w:r>
-          </w:p>
-        </w:tc>
-        <w:tc>
-          <w:tcPr>
-            <w:tcW w:type="dxa" w:w="2160"/>
-            <w:shd w:fill="F9F9F9"/>
-            <w:tcMar>
-              <w:top w:w="100" w:type="dxa"/>
-              <w:bottom w:w="100" w:type="dxa"/>
-              <w:left w:w="150" w:type="dxa"/>
-              <w:right w:w="150" w:type="dxa"/>
-            </w:tcMar>
-          </w:tcPr>
-          <w:p>
-            <w:pPr>
-              <w:spacing w:after="0" w:before="0"/>
-              <w:jc w:val="center"/>
-            </w:pPr>
-            <w:r>
-              <w:rPr>
-                <w:rFonts w:ascii="Arial" w:hAnsi="Arial"/>
-                <w:b w:val="0"/>
-                <w:i w:val="0"/>
-                <w:sz w:val="18"/>
-              </w:rPr>
-              <w:t>61</w:t>
-            </w:r>
-          </w:p>
-        </w:tc>
-        <w:tc>
-          <w:tcPr>
-            <w:tcW w:type="dxa" w:w="2160"/>
-            <w:shd w:fill="F9F9F9"/>
-            <w:tcMar>
-              <w:top w:w="100" w:type="dxa"/>
-              <w:bottom w:w="100" w:type="dxa"/>
-              <w:left w:w="150" w:type="dxa"/>
-              <w:right w:w="150" w:type="dxa"/>
-            </w:tcMar>
-          </w:tcPr>
-          <w:p>
-            <w:pPr>
-              <w:spacing w:after="0" w:before="0"/>
-              <w:jc w:val="center"/>
-            </w:pPr>
-            <w:r>
-              <w:rPr>
-                <w:rFonts w:ascii="Arial" w:hAnsi="Arial"/>
-                <w:b w:val="0"/>
-                <w:i w:val="0"/>
-                <w:sz w:val="18"/>
-              </w:rPr>
-              <w:t>1.32%</w:t>
+              <w:t>3.52%</w:t>
             </w:r>
           </w:p>
         </w:tc>
@@ -9216,11 +9106,11 @@
         </w:rPr>
         <w:t>1. Inferencia Principal mediante ADVI y Criterio Unificado de Convergencia: El método principal de estimación de la tesis es Inferencia Variacional por Diferenciación Automática (ADVI) en PyMC, optimizando el ELBO mediante Adam (learning_rate = 0.005) durante 50,000 iteraciones. Se definió un criterio formal de convergencia unificado: la variación de la media móvil del ELBO en las últimas 5,000 iteraciones respecto a las 5,000 anteriores debe ser menor al 0.1% (&lt; 0.001).</w:t>
         <w:br/>
-        <w:t>2. Modelo de Referencia por Capacidad Predictiva y Parsimonia: En la comparación formal fuera de muestra (LOO-CV), el Modelo (b) Binomial Negativa (ICAR) obtiene la mayor densidad predictiva esperada (ELPD_LOO = -1,233.75, SE = 26.76) y el menor número de observaciones con Pareto-k &gt; 0.7 (27 observaciones). El Modelo (c) Besag ICAR + No Estructurado (ELPD_LOO = -1,241.65, SE = 26.96, 38 observaciones k &gt; 0.7) y el Modelo (d) BYM2 (ELPD_LOO = -1,242.92, SE = 26.97) presentan densidades predictivas cercanas. La diferencia entre el Modelo (b) y el Modelo (c) es de 7.90 puntos con dse = 4.18, es decir, menor a dos errores estándar (|ΔELPD| &lt; 2·dse = 8.36). En la práctica ambos modelos empatan estadísticamente; por el principio de parsimonia (Navaja de Ockham: menor número de parámetros libres) y mejor comportamiento diagnóstico de Pareto-k, se selecciona formalmente el Modelo (b) como el modelo ganador de referencia metodológica de la tesis.</w:t>
+        <w:t>2. Modelo de Referencia por Capacidad Predictiva y Parsimonia: En la comparación formal fuera de muestra (LOO-CV), el Modelo (b) Binomial Negativa (ICAR) obtiene la mayor densidad predictiva esperada (ELPD_LOO = -1,233.75, SE = 26.76) y el menor número de observaciones con Pareto-k &gt; 0.7 (27 observaciones). El Modelo (c) Besag ICAR + No Estructurado (ELPD_LOO = -1,241.65, SE = 27.92, 38 observaciones k &gt; 0.7) y el Modelo (d) BYM2 (ELPD_LOO = -1,242.92, SE = 28.03) presentan densidades predictivas cercanas. La diferencia entre el Modelo (b) y el Modelo (c) es de 7.90 puntos con dse = 4.18, es decir, menor a dos errores estándar (|ΔELPD| &lt; 2·dse = 8.36). En la práctica ambos modelos empatan estadísticamente; por el principio de parsimonia (Navaja de Ockham: menor número de parámetros libres) y mejor comportamiento diagnóstico de Pareto-k, se selecciona formalmente el Modelo (b) como el modelo ganador de referencia metodológica de la tesis.</w:t>
         <w:br/>
-        <w:t>3. Parámetro de Mezcla Espacial (rho) y Advertencia Interpretativa: En el modelo BYM2, el parámetro rho con prior Beta(0.5, 0.5) presenta una fuerte discrepancia entre métodos de inferencia: bajo ADVI converge a rho ≈ 0.027, mientras que bajo muestreo exacto NUTS converge a rho ≈ 0.813. Por consiguiente, se advierte explícitamente que la lectura de rho bajo ADVI no es fiable para cuantificar la proporción de varianza espacial atribuible a contigüidad territorial.</w:t>
+        <w:t>3. Parámetro de Mezcla Espacial (rho) y Advertencia Interpretativa: En el modelo BYM2, el parámetro rho con prior Beta(0.5, 0.5) presenta una fuerte discrepancia entre métodos de inferencia: bajo ADVI converge a rho ≈ 0.9998, mientras que bajo muestreo exacto NUTS converge a rho ≈ 0.8199. Por consiguiente, se advierte explícitamente que la lectura de rho bajo ADVI no es fiable para cuantificar la proporción de varianza espacial atribuible a contigüidad territorial.</w:t>
         <w:br/>
-        <w:t>4. Diagnóstico de Pareto-k: En paneles cortos (T = 2 años) sobre 244 subcircuitos, la exclusión de una observación modifica la distribución condicional de los efectos latentes locales, elevando las ponderaciones de importancia con valores de k &gt; 0.7. Este comportamiento es una propiedad matemática conocida del estimador PSIS-LOO en modelos jerárquicos espaciales y no denota deficiencia del ajuste global.</w:t>
+        <w:t>4. Diagnóstico de Pareto-k: En paneles cortos (T = 2 años) sobre 244 subcircuitos, la exclusión de una observación modifica la distribución condicional de los efectos latentes locales, elevando las ponderaciones de importancia con valores de k &gt; 0.7.</w:t>
         <w:br/>
         <w:t>5. Contraste Anual (2025 vs. 2024): Al modelar dos años completos, un proceso autorregresivo RW1 no es paramétricamente identificable frente al intercepto cantonal. La especificación de un contraste fijo de año (beta_year con 2024 como referencia) resuelve la identificabilidad y provee una estimación directa de la variación cantonal en 2025.</w:t>
         <w:br/>
@@ -20334,6 +20224,611 @@
                 <w:sz w:val="18"/>
               </w:rPr>
               <w:t>244</w:t>
+            </w:r>
+          </w:p>
+        </w:tc>
+      </w:tr>
+    </w:tbl>
+    <w:p>
+      <w:pPr>
+        <w:spacing w:before="240"/>
+      </w:pPr>
+    </w:p>
+    <w:p>
+      <w:r>
+        <w:rPr>
+          <w:rFonts w:ascii="Arial" w:hAnsi="Arial"/>
+          <w:b/>
+          <w:i w:val="0"/>
+          <w:sz w:val="20"/>
+        </w:rPr>
+        <w:t>Tabla 14:</w:t>
+      </w:r>
+    </w:p>
+    <w:p>
+      <w:pPr>
+        <w:spacing w:after="120"/>
+      </w:pPr>
+      <w:r>
+        <w:rPr>
+          <w:rFonts w:ascii="Arial" w:hAnsi="Arial"/>
+          <w:b w:val="0"/>
+          <w:i/>
+          <w:sz w:val="20"/>
+        </w:rPr>
+        <w:t>Diagnósticos de Muestreo NUTS</w:t>
+      </w:r>
+    </w:p>
+    <w:tbl>
+      <w:tblPr>
+        <w:tblW w:type="auto" w:w="0"/>
+        <w:jc w:val="center"/>
+        <w:tblLook w:firstColumn="1" w:firstRow="1" w:lastColumn="0" w:lastRow="0" w:noHBand="0" w:noVBand="1" w:val="04A0"/>
+        <w:tblBorders>
+          <w:top w:val="single" w:sz="6" w:space="0" w:color="000000"/>
+          <w:bottom w:val="single" w:sz="6" w:space="0" w:color="000000"/>
+          <w:left w:val="none"/>
+          <w:right w:val="none"/>
+          <w:insideH w:val="single" w:sz="4" w:space="0" w:color="D3D3D3"/>
+          <w:insideV w:val="none"/>
+        </w:tblBorders>
+      </w:tblPr>
+      <w:tblGrid>
+        <w:gridCol w:w="1872"/>
+        <w:gridCol w:w="1872"/>
+        <w:gridCol w:w="1872"/>
+        <w:gridCol w:w="1872"/>
+        <w:gridCol w:w="1872"/>
+      </w:tblGrid>
+      <w:tr>
+        <w:tc>
+          <w:tcPr>
+            <w:tcW w:type="dxa" w:w="1872"/>
+            <w:shd w:fill="333333"/>
+            <w:tcMar>
+              <w:top w:w="120" w:type="dxa"/>
+              <w:bottom w:w="120" w:type="dxa"/>
+              <w:left w:w="150" w:type="dxa"/>
+              <w:right w:w="150" w:type="dxa"/>
+            </w:tcMar>
+          </w:tcPr>
+          <w:p>
+            <w:pPr>
+              <w:spacing w:after="0" w:before="0"/>
+              <w:jc w:val="center"/>
+            </w:pPr>
+            <w:r>
+              <w:rPr>
+                <w:rFonts w:ascii="Arial" w:hAnsi="Arial"/>
+                <w:b/>
+                <w:i w:val="0"/>
+                <w:color w:val="FFFFFF"/>
+                <w:sz w:val="19"/>
+              </w:rPr>
+              <w:t>Modelo</w:t>
+            </w:r>
+          </w:p>
+        </w:tc>
+        <w:tc>
+          <w:tcPr>
+            <w:tcW w:type="dxa" w:w="1872"/>
+            <w:shd w:fill="333333"/>
+            <w:tcMar>
+              <w:top w:w="120" w:type="dxa"/>
+              <w:bottom w:w="120" w:type="dxa"/>
+              <w:left w:w="150" w:type="dxa"/>
+              <w:right w:w="150" w:type="dxa"/>
+            </w:tcMar>
+          </w:tcPr>
+          <w:p>
+            <w:pPr>
+              <w:spacing w:after="0" w:before="0"/>
+              <w:jc w:val="center"/>
+            </w:pPr>
+            <w:r>
+              <w:rPr>
+                <w:rFonts w:ascii="Arial" w:hAnsi="Arial"/>
+                <w:b/>
+                <w:i w:val="0"/>
+                <w:color w:val="FFFFFF"/>
+                <w:sz w:val="19"/>
+              </w:rPr>
+              <w:t>R_hat_Maximo</w:t>
+            </w:r>
+          </w:p>
+        </w:tc>
+        <w:tc>
+          <w:tcPr>
+            <w:tcW w:type="dxa" w:w="1872"/>
+            <w:shd w:fill="333333"/>
+            <w:tcMar>
+              <w:top w:w="120" w:type="dxa"/>
+              <w:bottom w:w="120" w:type="dxa"/>
+              <w:left w:w="150" w:type="dxa"/>
+              <w:right w:w="150" w:type="dxa"/>
+            </w:tcMar>
+          </w:tcPr>
+          <w:p>
+            <w:pPr>
+              <w:spacing w:after="0" w:before="0"/>
+              <w:jc w:val="center"/>
+            </w:pPr>
+            <w:r>
+              <w:rPr>
+                <w:rFonts w:ascii="Arial" w:hAnsi="Arial"/>
+                <w:b/>
+                <w:i w:val="0"/>
+                <w:color w:val="FFFFFF"/>
+                <w:sz w:val="19"/>
+              </w:rPr>
+              <w:t>ESS_Bulk_Minimo</w:t>
+            </w:r>
+          </w:p>
+        </w:tc>
+        <w:tc>
+          <w:tcPr>
+            <w:tcW w:type="dxa" w:w="1872"/>
+            <w:shd w:fill="333333"/>
+            <w:tcMar>
+              <w:top w:w="120" w:type="dxa"/>
+              <w:bottom w:w="120" w:type="dxa"/>
+              <w:left w:w="150" w:type="dxa"/>
+              <w:right w:w="150" w:type="dxa"/>
+            </w:tcMar>
+          </w:tcPr>
+          <w:p>
+            <w:pPr>
+              <w:spacing w:after="0" w:before="0"/>
+              <w:jc w:val="center"/>
+            </w:pPr>
+            <w:r>
+              <w:rPr>
+                <w:rFonts w:ascii="Arial" w:hAnsi="Arial"/>
+                <w:b/>
+                <w:i w:val="0"/>
+                <w:color w:val="FFFFFF"/>
+                <w:sz w:val="19"/>
+              </w:rPr>
+              <w:t>ESS_Tail_Minimo</w:t>
+            </w:r>
+          </w:p>
+        </w:tc>
+        <w:tc>
+          <w:tcPr>
+            <w:tcW w:type="dxa" w:w="1872"/>
+            <w:shd w:fill="333333"/>
+            <w:tcMar>
+              <w:top w:w="120" w:type="dxa"/>
+              <w:bottom w:w="120" w:type="dxa"/>
+              <w:left w:w="150" w:type="dxa"/>
+              <w:right w:w="150" w:type="dxa"/>
+            </w:tcMar>
+          </w:tcPr>
+          <w:p>
+            <w:pPr>
+              <w:spacing w:after="0" w:before="0"/>
+              <w:jc w:val="center"/>
+            </w:pPr>
+            <w:r>
+              <w:rPr>
+                <w:rFonts w:ascii="Arial" w:hAnsi="Arial"/>
+                <w:b/>
+                <w:i w:val="0"/>
+                <w:color w:val="FFFFFF"/>
+                <w:sz w:val="19"/>
+              </w:rPr>
+              <w:t>Numero_Divergencias</w:t>
+            </w:r>
+          </w:p>
+        </w:tc>
+      </w:tr>
+      <w:tr>
+        <w:tc>
+          <w:tcPr>
+            <w:tcW w:type="dxa" w:w="1872"/>
+            <w:shd w:fill="FFFFFF"/>
+            <w:tcMar>
+              <w:top w:w="100" w:type="dxa"/>
+              <w:bottom w:w="100" w:type="dxa"/>
+              <w:left w:w="150" w:type="dxa"/>
+              <w:right w:w="150" w:type="dxa"/>
+            </w:tcMar>
+          </w:tcPr>
+          <w:p>
+            <w:pPr>
+              <w:spacing w:after="0" w:before="0"/>
+              <w:jc w:val="center"/>
+            </w:pPr>
+            <w:r>
+              <w:rPr>
+                <w:rFonts w:ascii="Arial" w:hAnsi="Arial"/>
+                <w:b w:val="0"/>
+                <w:i w:val="0"/>
+                <w:sz w:val="18"/>
+              </w:rPr>
+              <w:t>Modelo (b) Binomial Negativa (ICAR)</w:t>
+            </w:r>
+          </w:p>
+        </w:tc>
+        <w:tc>
+          <w:tcPr>
+            <w:tcW w:type="dxa" w:w="1872"/>
+            <w:shd w:fill="FFFFFF"/>
+            <w:tcMar>
+              <w:top w:w="100" w:type="dxa"/>
+              <w:bottom w:w="100" w:type="dxa"/>
+              <w:left w:w="150" w:type="dxa"/>
+              <w:right w:w="150" w:type="dxa"/>
+            </w:tcMar>
+          </w:tcPr>
+          <w:p>
+            <w:pPr>
+              <w:spacing w:after="0" w:before="0"/>
+              <w:jc w:val="center"/>
+            </w:pPr>
+            <w:r>
+              <w:rPr>
+                <w:rFonts w:ascii="Arial" w:hAnsi="Arial"/>
+                <w:b w:val="0"/>
+                <w:i w:val="0"/>
+                <w:sz w:val="18"/>
+              </w:rPr>
+              <w:t>1.01</w:t>
+            </w:r>
+          </w:p>
+        </w:tc>
+        <w:tc>
+          <w:tcPr>
+            <w:tcW w:type="dxa" w:w="1872"/>
+            <w:shd w:fill="FFFFFF"/>
+            <w:tcMar>
+              <w:top w:w="100" w:type="dxa"/>
+              <w:bottom w:w="100" w:type="dxa"/>
+              <w:left w:w="150" w:type="dxa"/>
+              <w:right w:w="150" w:type="dxa"/>
+            </w:tcMar>
+          </w:tcPr>
+          <w:p>
+            <w:pPr>
+              <w:spacing w:after="0" w:before="0"/>
+              <w:jc w:val="center"/>
+            </w:pPr>
+            <w:r>
+              <w:rPr>
+                <w:rFonts w:ascii="Arial" w:hAnsi="Arial"/>
+                <w:b w:val="0"/>
+                <w:i w:val="0"/>
+                <w:sz w:val="18"/>
+              </w:rPr>
+              <w:t>337.20</w:t>
+            </w:r>
+          </w:p>
+        </w:tc>
+        <w:tc>
+          <w:tcPr>
+            <w:tcW w:type="dxa" w:w="1872"/>
+            <w:shd w:fill="FFFFFF"/>
+            <w:tcMar>
+              <w:top w:w="100" w:type="dxa"/>
+              <w:bottom w:w="100" w:type="dxa"/>
+              <w:left w:w="150" w:type="dxa"/>
+              <w:right w:w="150" w:type="dxa"/>
+            </w:tcMar>
+          </w:tcPr>
+          <w:p>
+            <w:pPr>
+              <w:spacing w:after="0" w:before="0"/>
+              <w:jc w:val="center"/>
+            </w:pPr>
+            <w:r>
+              <w:rPr>
+                <w:rFonts w:ascii="Arial" w:hAnsi="Arial"/>
+                <w:b w:val="0"/>
+                <w:i w:val="0"/>
+                <w:sz w:val="18"/>
+              </w:rPr>
+              <w:t>700.04</w:t>
+            </w:r>
+          </w:p>
+        </w:tc>
+        <w:tc>
+          <w:tcPr>
+            <w:tcW w:type="dxa" w:w="1872"/>
+            <w:shd w:fill="FFFFFF"/>
+            <w:tcMar>
+              <w:top w:w="100" w:type="dxa"/>
+              <w:bottom w:w="100" w:type="dxa"/>
+              <w:left w:w="150" w:type="dxa"/>
+              <w:right w:w="150" w:type="dxa"/>
+            </w:tcMar>
+          </w:tcPr>
+          <w:p>
+            <w:pPr>
+              <w:spacing w:after="0" w:before="0"/>
+              <w:jc w:val="center"/>
+            </w:pPr>
+            <w:r>
+              <w:rPr>
+                <w:rFonts w:ascii="Arial" w:hAnsi="Arial"/>
+                <w:b w:val="0"/>
+                <w:i w:val="0"/>
+                <w:sz w:val="18"/>
+              </w:rPr>
+              <w:t>0</w:t>
+            </w:r>
+          </w:p>
+        </w:tc>
+      </w:tr>
+      <w:tr>
+        <w:tc>
+          <w:tcPr>
+            <w:tcW w:type="dxa" w:w="1872"/>
+            <w:shd w:fill="F9F9F9"/>
+            <w:tcMar>
+              <w:top w:w="100" w:type="dxa"/>
+              <w:bottom w:w="100" w:type="dxa"/>
+              <w:left w:w="150" w:type="dxa"/>
+              <w:right w:w="150" w:type="dxa"/>
+            </w:tcMar>
+          </w:tcPr>
+          <w:p>
+            <w:pPr>
+              <w:spacing w:after="0" w:before="0"/>
+              <w:jc w:val="center"/>
+            </w:pPr>
+            <w:r>
+              <w:rPr>
+                <w:rFonts w:ascii="Arial" w:hAnsi="Arial"/>
+                <w:b w:val="0"/>
+                <w:i w:val="0"/>
+                <w:sz w:val="18"/>
+              </w:rPr>
+              <w:t>Modelo (c) Besag ICAR + No Estructurado</w:t>
+            </w:r>
+          </w:p>
+        </w:tc>
+        <w:tc>
+          <w:tcPr>
+            <w:tcW w:type="dxa" w:w="1872"/>
+            <w:shd w:fill="F9F9F9"/>
+            <w:tcMar>
+              <w:top w:w="100" w:type="dxa"/>
+              <w:bottom w:w="100" w:type="dxa"/>
+              <w:left w:w="150" w:type="dxa"/>
+              <w:right w:w="150" w:type="dxa"/>
+            </w:tcMar>
+          </w:tcPr>
+          <w:p>
+            <w:pPr>
+              <w:spacing w:after="0" w:before="0"/>
+              <w:jc w:val="center"/>
+            </w:pPr>
+            <w:r>
+              <w:rPr>
+                <w:rFonts w:ascii="Arial" w:hAnsi="Arial"/>
+                <w:b w:val="0"/>
+                <w:i w:val="0"/>
+                <w:sz w:val="18"/>
+              </w:rPr>
+              <w:t>1.01</w:t>
+            </w:r>
+          </w:p>
+        </w:tc>
+        <w:tc>
+          <w:tcPr>
+            <w:tcW w:type="dxa" w:w="1872"/>
+            <w:shd w:fill="F9F9F9"/>
+            <w:tcMar>
+              <w:top w:w="100" w:type="dxa"/>
+              <w:bottom w:w="100" w:type="dxa"/>
+              <w:left w:w="150" w:type="dxa"/>
+              <w:right w:w="150" w:type="dxa"/>
+            </w:tcMar>
+          </w:tcPr>
+          <w:p>
+            <w:pPr>
+              <w:spacing w:after="0" w:before="0"/>
+              <w:jc w:val="center"/>
+            </w:pPr>
+            <w:r>
+              <w:rPr>
+                <w:rFonts w:ascii="Arial" w:hAnsi="Arial"/>
+                <w:b w:val="0"/>
+                <w:i w:val="0"/>
+                <w:sz w:val="18"/>
+              </w:rPr>
+              <w:t>119.30</w:t>
+            </w:r>
+          </w:p>
+        </w:tc>
+        <w:tc>
+          <w:tcPr>
+            <w:tcW w:type="dxa" w:w="1872"/>
+            <w:shd w:fill="F9F9F9"/>
+            <w:tcMar>
+              <w:top w:w="100" w:type="dxa"/>
+              <w:bottom w:w="100" w:type="dxa"/>
+              <w:left w:w="150" w:type="dxa"/>
+              <w:right w:w="150" w:type="dxa"/>
+            </w:tcMar>
+          </w:tcPr>
+          <w:p>
+            <w:pPr>
+              <w:spacing w:after="0" w:before="0"/>
+              <w:jc w:val="center"/>
+            </w:pPr>
+            <w:r>
+              <w:rPr>
+                <w:rFonts w:ascii="Arial" w:hAnsi="Arial"/>
+                <w:b w:val="0"/>
+                <w:i w:val="0"/>
+                <w:sz w:val="18"/>
+              </w:rPr>
+              <w:t>49.01</w:t>
+            </w:r>
+          </w:p>
+        </w:tc>
+        <w:tc>
+          <w:tcPr>
+            <w:tcW w:type="dxa" w:w="1872"/>
+            <w:shd w:fill="F9F9F9"/>
+            <w:tcMar>
+              <w:top w:w="100" w:type="dxa"/>
+              <w:bottom w:w="100" w:type="dxa"/>
+              <w:left w:w="150" w:type="dxa"/>
+              <w:right w:w="150" w:type="dxa"/>
+            </w:tcMar>
+          </w:tcPr>
+          <w:p>
+            <w:pPr>
+              <w:spacing w:after="0" w:before="0"/>
+              <w:jc w:val="center"/>
+            </w:pPr>
+            <w:r>
+              <w:rPr>
+                <w:rFonts w:ascii="Arial" w:hAnsi="Arial"/>
+                <w:b w:val="0"/>
+                <w:i w:val="0"/>
+                <w:sz w:val="18"/>
+              </w:rPr>
+              <w:t>0</w:t>
+            </w:r>
+          </w:p>
+        </w:tc>
+      </w:tr>
+      <w:tr>
+        <w:tc>
+          <w:tcPr>
+            <w:tcW w:type="dxa" w:w="1872"/>
+            <w:shd w:fill="FFFFFF"/>
+            <w:tcMar>
+              <w:top w:w="100" w:type="dxa"/>
+              <w:bottom w:w="100" w:type="dxa"/>
+              <w:left w:w="150" w:type="dxa"/>
+              <w:right w:w="150" w:type="dxa"/>
+            </w:tcMar>
+          </w:tcPr>
+          <w:p>
+            <w:pPr>
+              <w:spacing w:after="0" w:before="0"/>
+              <w:jc w:val="center"/>
+            </w:pPr>
+            <w:r>
+              <w:rPr>
+                <w:rFonts w:ascii="Arial" w:hAnsi="Arial"/>
+                <w:b w:val="0"/>
+                <w:i w:val="0"/>
+                <w:sz w:val="18"/>
+              </w:rPr>
+              <w:t>Modelo (d) BYM2 (Prior Beta(0.5, 0.5))</w:t>
+            </w:r>
+          </w:p>
+        </w:tc>
+        <w:tc>
+          <w:tcPr>
+            <w:tcW w:type="dxa" w:w="1872"/>
+            <w:shd w:fill="FFFFFF"/>
+            <w:tcMar>
+              <w:top w:w="100" w:type="dxa"/>
+              <w:bottom w:w="100" w:type="dxa"/>
+              <w:left w:w="150" w:type="dxa"/>
+              <w:right w:w="150" w:type="dxa"/>
+            </w:tcMar>
+          </w:tcPr>
+          <w:p>
+            <w:pPr>
+              <w:spacing w:after="0" w:before="0"/>
+              <w:jc w:val="center"/>
+            </w:pPr>
+            <w:r>
+              <w:rPr>
+                <w:rFonts w:ascii="Arial" w:hAnsi="Arial"/>
+                <w:b w:val="0"/>
+                <w:i w:val="0"/>
+                <w:sz w:val="18"/>
+              </w:rPr>
+              <w:t>1.05</w:t>
+            </w:r>
+          </w:p>
+        </w:tc>
+        <w:tc>
+          <w:tcPr>
+            <w:tcW w:type="dxa" w:w="1872"/>
+            <w:shd w:fill="FFFFFF"/>
+            <w:tcMar>
+              <w:top w:w="100" w:type="dxa"/>
+              <w:bottom w:w="100" w:type="dxa"/>
+              <w:left w:w="150" w:type="dxa"/>
+              <w:right w:w="150" w:type="dxa"/>
+            </w:tcMar>
+          </w:tcPr>
+          <w:p>
+            <w:pPr>
+              <w:spacing w:after="0" w:before="0"/>
+              <w:jc w:val="center"/>
+            </w:pPr>
+            <w:r>
+              <w:rPr>
+                <w:rFonts w:ascii="Arial" w:hAnsi="Arial"/>
+                <w:b w:val="0"/>
+                <w:i w:val="0"/>
+                <w:sz w:val="18"/>
+              </w:rPr>
+              <w:t>67.75</w:t>
+            </w:r>
+          </w:p>
+        </w:tc>
+        <w:tc>
+          <w:tcPr>
+            <w:tcW w:type="dxa" w:w="1872"/>
+            <w:shd w:fill="FFFFFF"/>
+            <w:tcMar>
+              <w:top w:w="100" w:type="dxa"/>
+              <w:bottom w:w="100" w:type="dxa"/>
+              <w:left w:w="150" w:type="dxa"/>
+              <w:right w:w="150" w:type="dxa"/>
+            </w:tcMar>
+          </w:tcPr>
+          <w:p>
+            <w:pPr>
+              <w:spacing w:after="0" w:before="0"/>
+              <w:jc w:val="center"/>
+            </w:pPr>
+            <w:r>
+              <w:rPr>
+                <w:rFonts w:ascii="Arial" w:hAnsi="Arial"/>
+                <w:b w:val="0"/>
+                <w:i w:val="0"/>
+                <w:sz w:val="18"/>
+              </w:rPr>
+              <w:t>41.13</w:t>
+            </w:r>
+          </w:p>
+        </w:tc>
+        <w:tc>
+          <w:tcPr>
+            <w:tcW w:type="dxa" w:w="1872"/>
+            <w:shd w:fill="FFFFFF"/>
+            <w:tcMar>
+              <w:top w:w="100" w:type="dxa"/>
+              <w:bottom w:w="100" w:type="dxa"/>
+              <w:left w:w="150" w:type="dxa"/>
+              <w:right w:w="150" w:type="dxa"/>
+            </w:tcMar>
+          </w:tcPr>
+          <w:p>
+            <w:pPr>
+              <w:spacing w:after="0" w:before="0"/>
+              <w:jc w:val="center"/>
+            </w:pPr>
+            <w:r>
+              <w:rPr>
+                <w:rFonts w:ascii="Arial" w:hAnsi="Arial"/>
+                <w:b w:val="0"/>
+                <w:i w:val="0"/>
+                <w:sz w:val="18"/>
+              </w:rPr>
+              <w:t>0</w:t>
             </w:r>
           </w:p>
         </w:tc>

</xml_diff>